<commit_message>
Canonical public legal on GitHub Pages (N78-Public-Legal).
Apps use nivo78.github.io legal URLs; N78-Stl Lite customer display name; kit/theme URL helpers.
</commit_message>
<xml_diff>
--- a/docs/Legal URL.docx
+++ b/docs/Legal URL.docx
@@ -121,7 +121,7 @@
           <w:b/>
           <w:bCs/>
         </w:rPr>
-        <w:t xml:space="preserve">N78 STL Lite — Privacy</w:t>
+        <w:t xml:space="preserve">N78-APA — Privacy</w:t>
       </w:r>
       <w:r>
         <w:t xml:space="preserve"> </w:t>
@@ -133,10 +133,10 @@
         <w:rPr>
           <w:rStyle w:val="VerbatimChar"/>
         </w:rPr>
-        <w:t xml:space="preserve">pages/N78 STL Lite.privacy.html</w:t>
-      </w:r>
-      <w:r>
-        <w:t xml:space="preserve">) — https://nivo78.github.io/N78-Public-Legal/pages/N78%20STL%20Lite.privacy.html</w:t>
+        <w:t xml:space="preserve">pages/N78-APA.privacy.html</w:t>
+      </w:r>
+      <w:r>
+        <w:t xml:space="preserve">) — https://nivo78.github.io/N78-Public-Legal/pages/N78-APA.privacy.html</w:t>
       </w:r>
     </w:p>
     <w:p>
@@ -152,7 +152,7 @@
           <w:b/>
           <w:bCs/>
         </w:rPr>
-        <w:t xml:space="preserve">N78 STL Lite — Terms</w:t>
+        <w:t xml:space="preserve">N78-APA — Terms</w:t>
       </w:r>
       <w:r>
         <w:t xml:space="preserve"> </w:t>
@@ -164,10 +164,10 @@
         <w:rPr>
           <w:rStyle w:val="VerbatimChar"/>
         </w:rPr>
-        <w:t xml:space="preserve">pages/N78 STL Lite.terms.html</w:t>
-      </w:r>
-      <w:r>
-        <w:t xml:space="preserve">) — https://nivo78.github.io/N78-Public-Legal/pages/N78%20STL%20Lite.terms.html</w:t>
+        <w:t xml:space="preserve">pages/N78-APA.terms.html</w:t>
+      </w:r>
+      <w:r>
+        <w:t xml:space="preserve">) — https://nivo78.github.io/N78-Public-Legal/pages/N78-APA.terms.html</w:t>
       </w:r>
     </w:p>
     <w:p>
@@ -183,7 +183,7 @@
           <w:b/>
           <w:bCs/>
         </w:rPr>
-        <w:t xml:space="preserve">N78-APA — Privacy</w:t>
+        <w:t xml:space="preserve">N78-Dash — Privacy</w:t>
       </w:r>
       <w:r>
         <w:t xml:space="preserve"> </w:t>
@@ -195,10 +195,10 @@
         <w:rPr>
           <w:rStyle w:val="VerbatimChar"/>
         </w:rPr>
-        <w:t xml:space="preserve">pages/N78-APA.privacy.html</w:t>
-      </w:r>
-      <w:r>
-        <w:t xml:space="preserve">) — https://nivo78.github.io/N78-Public-Legal/pages/N78-APA.privacy.html</w:t>
+        <w:t xml:space="preserve">pages/N78-Dash.privacy.html</w:t>
+      </w:r>
+      <w:r>
+        <w:t xml:space="preserve">) — https://nivo78.github.io/N78-Public-Legal/pages/N78-Dash.privacy.html</w:t>
       </w:r>
     </w:p>
     <w:p>
@@ -214,7 +214,7 @@
           <w:b/>
           <w:bCs/>
         </w:rPr>
-        <w:t xml:space="preserve">N78-APA — Terms</w:t>
+        <w:t xml:space="preserve">N78-Dash — Terms</w:t>
       </w:r>
       <w:r>
         <w:t xml:space="preserve"> </w:t>
@@ -226,10 +226,10 @@
         <w:rPr>
           <w:rStyle w:val="VerbatimChar"/>
         </w:rPr>
-        <w:t xml:space="preserve">pages/N78-APA.terms.html</w:t>
-      </w:r>
-      <w:r>
-        <w:t xml:space="preserve">) — https://nivo78.github.io/N78-Public-Legal/pages/N78-APA.terms.html</w:t>
+        <w:t xml:space="preserve">pages/N78-Dash.terms.html</w:t>
+      </w:r>
+      <w:r>
+        <w:t xml:space="preserve">) — https://nivo78.github.io/N78-Public-Legal/pages/N78-Dash.terms.html</w:t>
       </w:r>
     </w:p>
     <w:p>
@@ -245,7 +245,7 @@
           <w:b/>
           <w:bCs/>
         </w:rPr>
-        <w:t xml:space="preserve">N78-Dash — Privacy</w:t>
+        <w:t xml:space="preserve">N78-Electrical — Privacy</w:t>
       </w:r>
       <w:r>
         <w:t xml:space="preserve"> </w:t>
@@ -257,10 +257,10 @@
         <w:rPr>
           <w:rStyle w:val="VerbatimChar"/>
         </w:rPr>
-        <w:t xml:space="preserve">pages/N78-Dash.privacy.html</w:t>
-      </w:r>
-      <w:r>
-        <w:t xml:space="preserve">) — https://nivo78.github.io/N78-Public-Legal/pages/N78-Dash.privacy.html</w:t>
+        <w:t xml:space="preserve">pages/N78-Electrical.privacy.html</w:t>
+      </w:r>
+      <w:r>
+        <w:t xml:space="preserve">) — https://nivo78.github.io/N78-Public-Legal/pages/N78-Electrical.privacy.html</w:t>
       </w:r>
     </w:p>
     <w:p>
@@ -276,7 +276,7 @@
           <w:b/>
           <w:bCs/>
         </w:rPr>
-        <w:t xml:space="preserve">N78-Dash — Terms</w:t>
+        <w:t xml:space="preserve">N78-Electrical — Terms</w:t>
       </w:r>
       <w:r>
         <w:t xml:space="preserve"> </w:t>
@@ -288,10 +288,10 @@
         <w:rPr>
           <w:rStyle w:val="VerbatimChar"/>
         </w:rPr>
-        <w:t xml:space="preserve">pages/N78-Dash.terms.html</w:t>
-      </w:r>
-      <w:r>
-        <w:t xml:space="preserve">) — https://nivo78.github.io/N78-Public-Legal/pages/N78-Dash.terms.html</w:t>
+        <w:t xml:space="preserve">pages/N78-Electrical.terms.html</w:t>
+      </w:r>
+      <w:r>
+        <w:t xml:space="preserve">) — https://nivo78.github.io/N78-Public-Legal/pages/N78-Electrical.terms.html</w:t>
       </w:r>
     </w:p>
     <w:p>
@@ -307,7 +307,7 @@
           <w:b/>
           <w:bCs/>
         </w:rPr>
-        <w:t xml:space="preserve">N78-Electrical — Privacy</w:t>
+        <w:t xml:space="preserve">N78-Estimate — Privacy</w:t>
       </w:r>
       <w:r>
         <w:t xml:space="preserve"> </w:t>
@@ -319,10 +319,10 @@
         <w:rPr>
           <w:rStyle w:val="VerbatimChar"/>
         </w:rPr>
-        <w:t xml:space="preserve">pages/N78-Electrical.privacy.html</w:t>
-      </w:r>
-      <w:r>
-        <w:t xml:space="preserve">) — https://nivo78.github.io/N78-Public-Legal/pages/N78-Electrical.privacy.html</w:t>
+        <w:t xml:space="preserve">pages/N78-Estimate.privacy.html</w:t>
+      </w:r>
+      <w:r>
+        <w:t xml:space="preserve">) — https://nivo78.github.io/N78-Public-Legal/pages/N78-Estimate.privacy.html</w:t>
       </w:r>
     </w:p>
     <w:p>
@@ -338,7 +338,7 @@
           <w:b/>
           <w:bCs/>
         </w:rPr>
-        <w:t xml:space="preserve">N78-Electrical — Terms</w:t>
+        <w:t xml:space="preserve">N78-Estimate — Terms</w:t>
       </w:r>
       <w:r>
         <w:t xml:space="preserve"> </w:t>
@@ -350,10 +350,10 @@
         <w:rPr>
           <w:rStyle w:val="VerbatimChar"/>
         </w:rPr>
-        <w:t xml:space="preserve">pages/N78-Electrical.terms.html</w:t>
-      </w:r>
-      <w:r>
-        <w:t xml:space="preserve">) — https://nivo78.github.io/N78-Public-Legal/pages/N78-Electrical.terms.html</w:t>
+        <w:t xml:space="preserve">pages/N78-Estimate.terms.html</w:t>
+      </w:r>
+      <w:r>
+        <w:t xml:space="preserve">) — https://nivo78.github.io/N78-Public-Legal/pages/N78-Estimate.terms.html</w:t>
       </w:r>
     </w:p>
     <w:p>
@@ -369,7 +369,7 @@
           <w:b/>
           <w:bCs/>
         </w:rPr>
-        <w:t xml:space="preserve">N78-Estimate — Privacy</w:t>
+        <w:t xml:space="preserve">N78-Frame — Privacy</w:t>
       </w:r>
       <w:r>
         <w:t xml:space="preserve"> </w:t>
@@ -381,10 +381,10 @@
         <w:rPr>
           <w:rStyle w:val="VerbatimChar"/>
         </w:rPr>
-        <w:t xml:space="preserve">pages/N78-Estimate.privacy.html</w:t>
-      </w:r>
-      <w:r>
-        <w:t xml:space="preserve">) — https://nivo78.github.io/N78-Public-Legal/pages/N78-Estimate.privacy.html</w:t>
+        <w:t xml:space="preserve">pages/N78-Frame.privacy.html</w:t>
+      </w:r>
+      <w:r>
+        <w:t xml:space="preserve">) — https://nivo78.github.io/N78-Public-Legal/pages/N78-Frame.privacy.html</w:t>
       </w:r>
     </w:p>
     <w:p>
@@ -400,7 +400,7 @@
           <w:b/>
           <w:bCs/>
         </w:rPr>
-        <w:t xml:space="preserve">N78-Estimate — Terms</w:t>
+        <w:t xml:space="preserve">N78-Frame — Terms</w:t>
       </w:r>
       <w:r>
         <w:t xml:space="preserve"> </w:t>
@@ -412,10 +412,10 @@
         <w:rPr>
           <w:rStyle w:val="VerbatimChar"/>
         </w:rPr>
-        <w:t xml:space="preserve">pages/N78-Estimate.terms.html</w:t>
-      </w:r>
-      <w:r>
-        <w:t xml:space="preserve">) — https://nivo78.github.io/N78-Public-Legal/pages/N78-Estimate.terms.html</w:t>
+        <w:t xml:space="preserve">pages/N78-Frame.terms.html</w:t>
+      </w:r>
+      <w:r>
+        <w:t xml:space="preserve">) — https://nivo78.github.io/N78-Public-Legal/pages/N78-Frame.terms.html</w:t>
       </w:r>
     </w:p>
     <w:p>
@@ -431,7 +431,7 @@
           <w:b/>
           <w:bCs/>
         </w:rPr>
-        <w:t xml:space="preserve">N78-Frame — Privacy</w:t>
+        <w:t xml:space="preserve">N78-Life — Privacy</w:t>
       </w:r>
       <w:r>
         <w:t xml:space="preserve"> </w:t>
@@ -443,10 +443,10 @@
         <w:rPr>
           <w:rStyle w:val="VerbatimChar"/>
         </w:rPr>
-        <w:t xml:space="preserve">pages/N78-Frame.privacy.html</w:t>
-      </w:r>
-      <w:r>
-        <w:t xml:space="preserve">) — https://nivo78.github.io/N78-Public-Legal/pages/N78-Frame.privacy.html</w:t>
+        <w:t xml:space="preserve">pages/N78-Life.privacy.html</w:t>
+      </w:r>
+      <w:r>
+        <w:t xml:space="preserve">) — https://nivo78.github.io/N78-Public-Legal/pages/N78-Life.privacy.html</w:t>
       </w:r>
     </w:p>
     <w:p>
@@ -462,7 +462,7 @@
           <w:b/>
           <w:bCs/>
         </w:rPr>
-        <w:t xml:space="preserve">N78-Frame — Terms</w:t>
+        <w:t xml:space="preserve">N78-Life — Terms</w:t>
       </w:r>
       <w:r>
         <w:t xml:space="preserve"> </w:t>
@@ -474,10 +474,10 @@
         <w:rPr>
           <w:rStyle w:val="VerbatimChar"/>
         </w:rPr>
-        <w:t xml:space="preserve">pages/N78-Frame.terms.html</w:t>
-      </w:r>
-      <w:r>
-        <w:t xml:space="preserve">) — https://nivo78.github.io/N78-Public-Legal/pages/N78-Frame.terms.html</w:t>
+        <w:t xml:space="preserve">pages/N78-Life.terms.html</w:t>
+      </w:r>
+      <w:r>
+        <w:t xml:space="preserve">) — https://nivo78.github.io/N78-Public-Legal/pages/N78-Life.terms.html</w:t>
       </w:r>
     </w:p>
     <w:p>
@@ -493,7 +493,7 @@
           <w:b/>
           <w:bCs/>
         </w:rPr>
-        <w:t xml:space="preserve">N78-Life — Privacy</w:t>
+        <w:t xml:space="preserve">N78-Machining — Privacy</w:t>
       </w:r>
       <w:r>
         <w:t xml:space="preserve"> </w:t>
@@ -505,10 +505,10 @@
         <w:rPr>
           <w:rStyle w:val="VerbatimChar"/>
         </w:rPr>
-        <w:t xml:space="preserve">pages/N78-Life.privacy.html</w:t>
-      </w:r>
-      <w:r>
-        <w:t xml:space="preserve">) — https://nivo78.github.io/N78-Public-Legal/pages/N78-Life.privacy.html</w:t>
+        <w:t xml:space="preserve">pages/N78-Machining.privacy.html</w:t>
+      </w:r>
+      <w:r>
+        <w:t xml:space="preserve">) — https://nivo78.github.io/N78-Public-Legal/pages/N78-Machining.privacy.html</w:t>
       </w:r>
     </w:p>
     <w:p>
@@ -524,7 +524,7 @@
           <w:b/>
           <w:bCs/>
         </w:rPr>
-        <w:t xml:space="preserve">N78-Life — Terms</w:t>
+        <w:t xml:space="preserve">N78-Machining — Terms</w:t>
       </w:r>
       <w:r>
         <w:t xml:space="preserve"> </w:t>
@@ -536,10 +536,10 @@
         <w:rPr>
           <w:rStyle w:val="VerbatimChar"/>
         </w:rPr>
-        <w:t xml:space="preserve">pages/N78-Life.terms.html</w:t>
-      </w:r>
-      <w:r>
-        <w:t xml:space="preserve">) — https://nivo78.github.io/N78-Public-Legal/pages/N78-Life.terms.html</w:t>
+        <w:t xml:space="preserve">pages/N78-Machining.terms.html</w:t>
+      </w:r>
+      <w:r>
+        <w:t xml:space="preserve">) — https://nivo78.github.io/N78-Public-Legal/pages/N78-Machining.terms.html</w:t>
       </w:r>
     </w:p>
     <w:p>
@@ -555,7 +555,7 @@
           <w:b/>
           <w:bCs/>
         </w:rPr>
-        <w:t xml:space="preserve">N78-Machining — Privacy</w:t>
+        <w:t xml:space="preserve">N78-Ops — Privacy</w:t>
       </w:r>
       <w:r>
         <w:t xml:space="preserve"> </w:t>
@@ -567,10 +567,10 @@
         <w:rPr>
           <w:rStyle w:val="VerbatimChar"/>
         </w:rPr>
-        <w:t xml:space="preserve">pages/N78-Machining.privacy.html</w:t>
-      </w:r>
-      <w:r>
-        <w:t xml:space="preserve">) — https://nivo78.github.io/N78-Public-Legal/pages/N78-Machining.privacy.html</w:t>
+        <w:t xml:space="preserve">pages/N78-Ops.privacy.html</w:t>
+      </w:r>
+      <w:r>
+        <w:t xml:space="preserve">) — https://nivo78.github.io/N78-Public-Legal/pages/N78-Ops.privacy.html</w:t>
       </w:r>
     </w:p>
     <w:p>
@@ -586,7 +586,7 @@
           <w:b/>
           <w:bCs/>
         </w:rPr>
-        <w:t xml:space="preserve">N78-Machining — Terms</w:t>
+        <w:t xml:space="preserve">N78-Ops — Terms</w:t>
       </w:r>
       <w:r>
         <w:t xml:space="preserve"> </w:t>
@@ -598,10 +598,10 @@
         <w:rPr>
           <w:rStyle w:val="VerbatimChar"/>
         </w:rPr>
-        <w:t xml:space="preserve">pages/N78-Machining.terms.html</w:t>
-      </w:r>
-      <w:r>
-        <w:t xml:space="preserve">) — https://nivo78.github.io/N78-Public-Legal/pages/N78-Machining.terms.html</w:t>
+        <w:t xml:space="preserve">pages/N78-Ops.terms.html</w:t>
+      </w:r>
+      <w:r>
+        <w:t xml:space="preserve">) — https://nivo78.github.io/N78-Public-Legal/pages/N78-Ops.terms.html</w:t>
       </w:r>
     </w:p>
     <w:p>
@@ -617,7 +617,7 @@
           <w:b/>
           <w:bCs/>
         </w:rPr>
-        <w:t xml:space="preserve">N78-Ops — Privacy</w:t>
+        <w:t xml:space="preserve">N78-Probe — Privacy</w:t>
       </w:r>
       <w:r>
         <w:t xml:space="preserve"> </w:t>
@@ -629,10 +629,10 @@
         <w:rPr>
           <w:rStyle w:val="VerbatimChar"/>
         </w:rPr>
-        <w:t xml:space="preserve">pages/N78-Ops.privacy.html</w:t>
-      </w:r>
-      <w:r>
-        <w:t xml:space="preserve">) — https://nivo78.github.io/N78-Public-Legal/pages/N78-Ops.privacy.html</w:t>
+        <w:t xml:space="preserve">pages/N78-Probe.privacy.html</w:t>
+      </w:r>
+      <w:r>
+        <w:t xml:space="preserve">) — https://nivo78.github.io/N78-Public-Legal/pages/N78-Probe.privacy.html</w:t>
       </w:r>
     </w:p>
     <w:p>
@@ -648,7 +648,7 @@
           <w:b/>
           <w:bCs/>
         </w:rPr>
-        <w:t xml:space="preserve">N78-Ops — Terms</w:t>
+        <w:t xml:space="preserve">N78-Probe — Terms</w:t>
       </w:r>
       <w:r>
         <w:t xml:space="preserve"> </w:t>
@@ -660,10 +660,10 @@
         <w:rPr>
           <w:rStyle w:val="VerbatimChar"/>
         </w:rPr>
-        <w:t xml:space="preserve">pages/N78-Ops.terms.html</w:t>
-      </w:r>
-      <w:r>
-        <w:t xml:space="preserve">) — https://nivo78.github.io/N78-Public-Legal/pages/N78-Ops.terms.html</w:t>
+        <w:t xml:space="preserve">pages/N78-Probe.terms.html</w:t>
+      </w:r>
+      <w:r>
+        <w:t xml:space="preserve">) — https://nivo78.github.io/N78-Public-Legal/pages/N78-Probe.terms.html</w:t>
       </w:r>
     </w:p>
     <w:p>
@@ -679,7 +679,7 @@
           <w:b/>
           <w:bCs/>
         </w:rPr>
-        <w:t xml:space="preserve">N78-Probe — Privacy</w:t>
+        <w:t xml:space="preserve">N78-Stl Lite — Privacy</w:t>
       </w:r>
       <w:r>
         <w:t xml:space="preserve"> </w:t>
@@ -691,10 +691,10 @@
         <w:rPr>
           <w:rStyle w:val="VerbatimChar"/>
         </w:rPr>
-        <w:t xml:space="preserve">pages/N78-Probe.privacy.html</w:t>
-      </w:r>
-      <w:r>
-        <w:t xml:space="preserve">) — https://nivo78.github.io/N78-Public-Legal/pages/N78-Probe.privacy.html</w:t>
+        <w:t xml:space="preserve">pages/N78-Stl Lite.privacy.html</w:t>
+      </w:r>
+      <w:r>
+        <w:t xml:space="preserve">) — https://nivo78.github.io/N78-Public-Legal/pages/N78-Stl%20Lite.privacy.html</w:t>
       </w:r>
     </w:p>
     <w:p>
@@ -710,7 +710,7 @@
           <w:b/>
           <w:bCs/>
         </w:rPr>
-        <w:t xml:space="preserve">N78-Probe — Terms</w:t>
+        <w:t xml:space="preserve">N78-Stl Lite — Terms</w:t>
       </w:r>
       <w:r>
         <w:t xml:space="preserve"> </w:t>
@@ -722,10 +722,10 @@
         <w:rPr>
           <w:rStyle w:val="VerbatimChar"/>
         </w:rPr>
-        <w:t xml:space="preserve">pages/N78-Probe.terms.html</w:t>
-      </w:r>
-      <w:r>
-        <w:t xml:space="preserve">) — https://nivo78.github.io/N78-Public-Legal/pages/N78-Probe.terms.html</w:t>
+        <w:t xml:space="preserve">pages/N78-Stl Lite.terms.html</w:t>
+      </w:r>
+      <w:r>
+        <w:t xml:space="preserve">) — https://nivo78.github.io/N78-Public-Legal/pages/N78-Stl%20Lite.terms.html</w:t>
       </w:r>
     </w:p>
     <w:p>

</xml_diff>

<commit_message>
Normalize StlLite legal page filenames and refresh APA hosted legal.
Replace spaced Stl Lite HTML with StlLite slugs; update index, legal URL docs, and sync tooling.

Co-authored-by: Cursor <cursoragent@cursor.com>
</commit_message>
<xml_diff>
--- a/docs/Legal URL.docx
+++ b/docs/Legal URL.docx
@@ -679,7 +679,7 @@
           <w:b/>
           <w:bCs/>
         </w:rPr>
-        <w:t xml:space="preserve">N78-Stl Lite — Privacy</w:t>
+        <w:t xml:space="preserve">N78-StlLite — Privacy</w:t>
       </w:r>
       <w:r>
         <w:t xml:space="preserve"> </w:t>
@@ -691,10 +691,10 @@
         <w:rPr>
           <w:rStyle w:val="VerbatimChar"/>
         </w:rPr>
-        <w:t xml:space="preserve">pages/N78-Stl Lite.privacy.html</w:t>
-      </w:r>
-      <w:r>
-        <w:t xml:space="preserve">) — https://nivo78.github.io/N78-Public-Legal/pages/N78-Stl%20Lite.privacy.html</w:t>
+        <w:t xml:space="preserve">pages/N78-StlLite.privacy.html</w:t>
+      </w:r>
+      <w:r>
+        <w:t xml:space="preserve">) — https://nivo78.github.io/N78-Public-Legal/pages/N78-StlLite.privacy.html</w:t>
       </w:r>
     </w:p>
     <w:p>
@@ -710,7 +710,7 @@
           <w:b/>
           <w:bCs/>
         </w:rPr>
-        <w:t xml:space="preserve">N78-Stl Lite — Terms</w:t>
+        <w:t xml:space="preserve">N78-StlLite — Terms</w:t>
       </w:r>
       <w:r>
         <w:t xml:space="preserve"> </w:t>
@@ -722,10 +722,10 @@
         <w:rPr>
           <w:rStyle w:val="VerbatimChar"/>
         </w:rPr>
-        <w:t xml:space="preserve">pages/N78-Stl Lite.terms.html</w:t>
-      </w:r>
-      <w:r>
-        <w:t xml:space="preserve">) — https://nivo78.github.io/N78-Public-Legal/pages/N78-Stl%20Lite.terms.html</w:t>
+        <w:t xml:space="preserve">pages/N78-StlLite.terms.html</w:t>
+      </w:r>
+      <w:r>
+        <w:t xml:space="preserve">) — https://nivo78.github.io/N78-Public-Legal/pages/N78-StlLite.terms.html</w:t>
       </w:r>
     </w:p>
     <w:p>

</xml_diff>

<commit_message>
chore(legal): N78-Ops privacy Last updated and standards mirror sync
Align GitHub Pages privacy body and legal URL docs with deploy sync; refresh family standards reference copies.
</commit_message>
<xml_diff>
--- a/docs/Legal URL.docx
+++ b/docs/Legal URL.docx
@@ -16,7 +16,7 @@
         <w:pStyle w:val="FirstParagraph"/>
       </w:pPr>
       <w:r>
-        <w:t xml:space="preserve">Generated: September 30, 2026</w:t>
+        <w:t xml:space="preserve">Generated: October 1, 2026</w:t>
       </w:r>
     </w:p>
     <w:p>
@@ -679,7 +679,7 @@
           <w:b/>
           <w:bCs/>
         </w:rPr>
-        <w:t xml:space="preserve">N78-StlLite — Privacy</w:t>
+        <w:t xml:space="preserve">N78-ThinStl — Privacy</w:t>
       </w:r>
       <w:r>
         <w:t xml:space="preserve"> </w:t>
@@ -691,10 +691,10 @@
         <w:rPr>
           <w:rStyle w:val="VerbatimChar"/>
         </w:rPr>
-        <w:t xml:space="preserve">pages/N78-StlLite.privacy.html</w:t>
-      </w:r>
-      <w:r>
-        <w:t xml:space="preserve">) — https://nivo78.github.io/N78-Public-Legal/pages/N78-StlLite.privacy.html</w:t>
+        <w:t xml:space="preserve">pages/N78-ThinStl.privacy.html</w:t>
+      </w:r>
+      <w:r>
+        <w:t xml:space="preserve">) — https://nivo78.github.io/N78-Public-Legal/pages/N78-ThinStl.privacy.html</w:t>
       </w:r>
     </w:p>
     <w:p>
@@ -710,7 +710,7 @@
           <w:b/>
           <w:bCs/>
         </w:rPr>
-        <w:t xml:space="preserve">N78-StlLite — Terms</w:t>
+        <w:t xml:space="preserve">N78-ThinStl — Terms</w:t>
       </w:r>
       <w:r>
         <w:t xml:space="preserve"> </w:t>
@@ -722,10 +722,10 @@
         <w:rPr>
           <w:rStyle w:val="VerbatimChar"/>
         </w:rPr>
-        <w:t xml:space="preserve">pages/N78-StlLite.terms.html</w:t>
-      </w:r>
-      <w:r>
-        <w:t xml:space="preserve">) — https://nivo78.github.io/N78-Public-Legal/pages/N78-StlLite.terms.html</w:t>
+        <w:t xml:space="preserve">pages/N78-ThinStl.terms.html</w:t>
+      </w:r>
+      <w:r>
+        <w:t xml:space="preserve">) — https://nivo78.github.io/N78-Public-Legal/pages/N78-ThinStl.terms.html</w:t>
       </w:r>
     </w:p>
     <w:p>

</xml_diff>

<commit_message>
Publish privacy, terms, and operator pages for all family apps.
Add refresh pipeline, critical provisions and cross-links on 57 pages, and declare this repo the sole canonical authority for hosted legal HTML.
</commit_message>
<xml_diff>
--- a/docs/Legal URL.docx
+++ b/docs/Legal URL.docx
@@ -16,7 +16,7 @@
         <w:pStyle w:val="FirstParagraph"/>
       </w:pPr>
       <w:r>
-        <w:t xml:space="preserve">Generated: October 3, 2026</w:t>
+        <w:t xml:space="preserve">Generated: October 4, 2026</w:t>
       </w:r>
     </w:p>
     <w:p>
@@ -90,13 +90,13 @@
       </w:r>
     </w:p>
     <w:bookmarkEnd w:id="9"/>
-    <w:bookmarkStart w:id="10" w:name="product-privacy-and-terms-pages"/>
+    <w:bookmarkStart w:id="10" w:name="X9318ddc3dfda6b1881a04bb1cb7295328fcc018"/>
     <w:p>
       <w:pPr>
         <w:pStyle w:val="Heading2"/>
       </w:pPr>
       <w:r>
-        <w:t xml:space="preserve">Product privacy and terms (</w:t>
+        <w:t xml:space="preserve">Product privacy, terms, and operator disclaimer (</w:t>
       </w:r>
       <w:r>
         <w:rPr>
@@ -121,6 +121,130 @@
           <w:b/>
           <w:bCs/>
         </w:rPr>
+        <w:t xml:space="preserve">Integrator — Operator disclaimer</w:t>
+      </w:r>
+      <w:r>
+        <w:t xml:space="preserve"> </w:t>
+      </w:r>
+      <w:r>
+        <w:t xml:space="preserve">(</w:t>
+      </w:r>
+      <w:r>
+        <w:rPr>
+          <w:rStyle w:val="VerbatimChar"/>
+        </w:rPr>
+        <w:t xml:space="preserve">pages/Integrator.operator.html</w:t>
+      </w:r>
+      <w:r>
+        <w:t xml:space="preserve">) — https://nivo78.github.io/N78-Public-Legal/pages/Integrator.operator.html</w:t>
+      </w:r>
+    </w:p>
+    <w:p>
+      <w:pPr>
+        <w:pStyle w:val="Compact"/>
+        <w:numPr>
+          <w:ilvl w:val="0"/>
+          <w:numId w:val="1002"/>
+        </w:numPr>
+      </w:pPr>
+      <w:r>
+        <w:rPr>
+          <w:b/>
+          <w:bCs/>
+        </w:rPr>
+        <w:t xml:space="preserve">Integrator — Privacy</w:t>
+      </w:r>
+      <w:r>
+        <w:t xml:space="preserve"> </w:t>
+      </w:r>
+      <w:r>
+        <w:t xml:space="preserve">(</w:t>
+      </w:r>
+      <w:r>
+        <w:rPr>
+          <w:rStyle w:val="VerbatimChar"/>
+        </w:rPr>
+        <w:t xml:space="preserve">pages/Integrator.privacy.html</w:t>
+      </w:r>
+      <w:r>
+        <w:t xml:space="preserve">) — https://nivo78.github.io/N78-Public-Legal/pages/Integrator.privacy.html</w:t>
+      </w:r>
+    </w:p>
+    <w:p>
+      <w:pPr>
+        <w:pStyle w:val="Compact"/>
+        <w:numPr>
+          <w:ilvl w:val="0"/>
+          <w:numId w:val="1002"/>
+        </w:numPr>
+      </w:pPr>
+      <w:r>
+        <w:rPr>
+          <w:b/>
+          <w:bCs/>
+        </w:rPr>
+        <w:t xml:space="preserve">Integrator — Terms</w:t>
+      </w:r>
+      <w:r>
+        <w:t xml:space="preserve"> </w:t>
+      </w:r>
+      <w:r>
+        <w:t xml:space="preserve">(</w:t>
+      </w:r>
+      <w:r>
+        <w:rPr>
+          <w:rStyle w:val="VerbatimChar"/>
+        </w:rPr>
+        <w:t xml:space="preserve">pages/Integrator.terms.html</w:t>
+      </w:r>
+      <w:r>
+        <w:t xml:space="preserve">) — https://nivo78.github.io/N78-Public-Legal/pages/Integrator.terms.html</w:t>
+      </w:r>
+    </w:p>
+    <w:p>
+      <w:pPr>
+        <w:pStyle w:val="Compact"/>
+        <w:numPr>
+          <w:ilvl w:val="0"/>
+          <w:numId w:val="1002"/>
+        </w:numPr>
+      </w:pPr>
+      <w:r>
+        <w:rPr>
+          <w:b/>
+          <w:bCs/>
+        </w:rPr>
+        <w:t xml:space="preserve">N78-APA — Operator disclaimer</w:t>
+      </w:r>
+      <w:r>
+        <w:t xml:space="preserve"> </w:t>
+      </w:r>
+      <w:r>
+        <w:t xml:space="preserve">(</w:t>
+      </w:r>
+      <w:r>
+        <w:rPr>
+          <w:rStyle w:val="VerbatimChar"/>
+        </w:rPr>
+        <w:t xml:space="preserve">pages/N78-APA.operator.html</w:t>
+      </w:r>
+      <w:r>
+        <w:t xml:space="preserve">) — https://nivo78.github.io/N78-Public-Legal/pages/N78-APA.operator.html</w:t>
+      </w:r>
+    </w:p>
+    <w:p>
+      <w:pPr>
+        <w:pStyle w:val="Compact"/>
+        <w:numPr>
+          <w:ilvl w:val="0"/>
+          <w:numId w:val="1002"/>
+        </w:numPr>
+      </w:pPr>
+      <w:r>
+        <w:rPr>
+          <w:b/>
+          <w:bCs/>
+        </w:rPr>
         <w:t xml:space="preserve">N78-APA — Privacy</w:t>
       </w:r>
       <w:r>
@@ -183,6 +307,223 @@
           <w:b/>
           <w:bCs/>
         </w:rPr>
+        <w:t xml:space="preserve">N78-BizBlocks — Operator disclaimer</w:t>
+      </w:r>
+      <w:r>
+        <w:t xml:space="preserve"> </w:t>
+      </w:r>
+      <w:r>
+        <w:t xml:space="preserve">(</w:t>
+      </w:r>
+      <w:r>
+        <w:rPr>
+          <w:rStyle w:val="VerbatimChar"/>
+        </w:rPr>
+        <w:t xml:space="preserve">pages/N78-BizBlocks.operator.html</w:t>
+      </w:r>
+      <w:r>
+        <w:t xml:space="preserve">) — https://nivo78.github.io/N78-Public-Legal/pages/N78-BizBlocks.operator.html</w:t>
+      </w:r>
+    </w:p>
+    <w:p>
+      <w:pPr>
+        <w:pStyle w:val="Compact"/>
+        <w:numPr>
+          <w:ilvl w:val="0"/>
+          <w:numId w:val="1002"/>
+        </w:numPr>
+      </w:pPr>
+      <w:r>
+        <w:rPr>
+          <w:b/>
+          <w:bCs/>
+        </w:rPr>
+        <w:t xml:space="preserve">N78-BizBlocks — Privacy</w:t>
+      </w:r>
+      <w:r>
+        <w:t xml:space="preserve"> </w:t>
+      </w:r>
+      <w:r>
+        <w:t xml:space="preserve">(</w:t>
+      </w:r>
+      <w:r>
+        <w:rPr>
+          <w:rStyle w:val="VerbatimChar"/>
+        </w:rPr>
+        <w:t xml:space="preserve">pages/N78-BizBlocks.privacy.html</w:t>
+      </w:r>
+      <w:r>
+        <w:t xml:space="preserve">) — https://nivo78.github.io/N78-Public-Legal/pages/N78-BizBlocks.privacy.html</w:t>
+      </w:r>
+    </w:p>
+    <w:p>
+      <w:pPr>
+        <w:pStyle w:val="Compact"/>
+        <w:numPr>
+          <w:ilvl w:val="0"/>
+          <w:numId w:val="1002"/>
+        </w:numPr>
+      </w:pPr>
+      <w:r>
+        <w:rPr>
+          <w:b/>
+          <w:bCs/>
+        </w:rPr>
+        <w:t xml:space="preserve">N78-BizBlocks — Terms</w:t>
+      </w:r>
+      <w:r>
+        <w:t xml:space="preserve"> </w:t>
+      </w:r>
+      <w:r>
+        <w:t xml:space="preserve">(</w:t>
+      </w:r>
+      <w:r>
+        <w:rPr>
+          <w:rStyle w:val="VerbatimChar"/>
+        </w:rPr>
+        <w:t xml:space="preserve">pages/N78-BizBlocks.terms.html</w:t>
+      </w:r>
+      <w:r>
+        <w:t xml:space="preserve">) — https://nivo78.github.io/N78-Public-Legal/pages/N78-BizBlocks.terms.html</w:t>
+      </w:r>
+    </w:p>
+    <w:p>
+      <w:pPr>
+        <w:pStyle w:val="Compact"/>
+        <w:numPr>
+          <w:ilvl w:val="0"/>
+          <w:numId w:val="1002"/>
+        </w:numPr>
+      </w:pPr>
+      <w:r>
+        <w:rPr>
+          <w:b/>
+          <w:bCs/>
+        </w:rPr>
+        <w:t xml:space="preserve">N78-Book — Operator disclaimer</w:t>
+      </w:r>
+      <w:r>
+        <w:t xml:space="preserve"> </w:t>
+      </w:r>
+      <w:r>
+        <w:t xml:space="preserve">(</w:t>
+      </w:r>
+      <w:r>
+        <w:rPr>
+          <w:rStyle w:val="VerbatimChar"/>
+        </w:rPr>
+        <w:t xml:space="preserve">pages/N78-Book.operator.html</w:t>
+      </w:r>
+      <w:r>
+        <w:t xml:space="preserve">) — https://nivo78.github.io/N78-Public-Legal/pages/N78-Book.operator.html</w:t>
+      </w:r>
+    </w:p>
+    <w:p>
+      <w:pPr>
+        <w:pStyle w:val="Compact"/>
+        <w:numPr>
+          <w:ilvl w:val="0"/>
+          <w:numId w:val="1002"/>
+        </w:numPr>
+      </w:pPr>
+      <w:r>
+        <w:rPr>
+          <w:b/>
+          <w:bCs/>
+        </w:rPr>
+        <w:t xml:space="preserve">N78-Book — Privacy</w:t>
+      </w:r>
+      <w:r>
+        <w:t xml:space="preserve"> </w:t>
+      </w:r>
+      <w:r>
+        <w:t xml:space="preserve">(</w:t>
+      </w:r>
+      <w:r>
+        <w:rPr>
+          <w:rStyle w:val="VerbatimChar"/>
+        </w:rPr>
+        <w:t xml:space="preserve">pages/N78-Book.privacy.html</w:t>
+      </w:r>
+      <w:r>
+        <w:t xml:space="preserve">) — https://nivo78.github.io/N78-Public-Legal/pages/N78-Book.privacy.html</w:t>
+      </w:r>
+    </w:p>
+    <w:p>
+      <w:pPr>
+        <w:pStyle w:val="Compact"/>
+        <w:numPr>
+          <w:ilvl w:val="0"/>
+          <w:numId w:val="1002"/>
+        </w:numPr>
+      </w:pPr>
+      <w:r>
+        <w:rPr>
+          <w:b/>
+          <w:bCs/>
+        </w:rPr>
+        <w:t xml:space="preserve">N78-Book — Terms</w:t>
+      </w:r>
+      <w:r>
+        <w:t xml:space="preserve"> </w:t>
+      </w:r>
+      <w:r>
+        <w:t xml:space="preserve">(</w:t>
+      </w:r>
+      <w:r>
+        <w:rPr>
+          <w:rStyle w:val="VerbatimChar"/>
+        </w:rPr>
+        <w:t xml:space="preserve">pages/N78-Book.terms.html</w:t>
+      </w:r>
+      <w:r>
+        <w:t xml:space="preserve">) — https://nivo78.github.io/N78-Public-Legal/pages/N78-Book.terms.html</w:t>
+      </w:r>
+    </w:p>
+    <w:p>
+      <w:pPr>
+        <w:pStyle w:val="Compact"/>
+        <w:numPr>
+          <w:ilvl w:val="0"/>
+          <w:numId w:val="1002"/>
+        </w:numPr>
+      </w:pPr>
+      <w:r>
+        <w:rPr>
+          <w:b/>
+          <w:bCs/>
+        </w:rPr>
+        <w:t xml:space="preserve">N78-Dash — Operator disclaimer</w:t>
+      </w:r>
+      <w:r>
+        <w:t xml:space="preserve"> </w:t>
+      </w:r>
+      <w:r>
+        <w:t xml:space="preserve">(</w:t>
+      </w:r>
+      <w:r>
+        <w:rPr>
+          <w:rStyle w:val="VerbatimChar"/>
+        </w:rPr>
+        <w:t xml:space="preserve">pages/N78-Dash.operator.html</w:t>
+      </w:r>
+      <w:r>
+        <w:t xml:space="preserve">) — https://nivo78.github.io/N78-Public-Legal/pages/N78-Dash.operator.html</w:t>
+      </w:r>
+    </w:p>
+    <w:p>
+      <w:pPr>
+        <w:pStyle w:val="Compact"/>
+        <w:numPr>
+          <w:ilvl w:val="0"/>
+          <w:numId w:val="1002"/>
+        </w:numPr>
+      </w:pPr>
+      <w:r>
+        <w:rPr>
+          <w:b/>
+          <w:bCs/>
+        </w:rPr>
         <w:t xml:space="preserve">N78-Dash — Privacy</w:t>
       </w:r>
       <w:r>
@@ -245,6 +586,37 @@
           <w:b/>
           <w:bCs/>
         </w:rPr>
+        <w:t xml:space="preserve">N78-Electrical — Operator disclaimer</w:t>
+      </w:r>
+      <w:r>
+        <w:t xml:space="preserve"> </w:t>
+      </w:r>
+      <w:r>
+        <w:t xml:space="preserve">(</w:t>
+      </w:r>
+      <w:r>
+        <w:rPr>
+          <w:rStyle w:val="VerbatimChar"/>
+        </w:rPr>
+        <w:t xml:space="preserve">pages/N78-Electrical.operator.html</w:t>
+      </w:r>
+      <w:r>
+        <w:t xml:space="preserve">) — https://nivo78.github.io/N78-Public-Legal/pages/N78-Electrical.operator.html</w:t>
+      </w:r>
+    </w:p>
+    <w:p>
+      <w:pPr>
+        <w:pStyle w:val="Compact"/>
+        <w:numPr>
+          <w:ilvl w:val="0"/>
+          <w:numId w:val="1002"/>
+        </w:numPr>
+      </w:pPr>
+      <w:r>
+        <w:rPr>
+          <w:b/>
+          <w:bCs/>
+        </w:rPr>
         <w:t xml:space="preserve">N78-Electrical — Privacy</w:t>
       </w:r>
       <w:r>
@@ -307,6 +679,37 @@
           <w:b/>
           <w:bCs/>
         </w:rPr>
+        <w:t xml:space="preserve">N78-Estimate — Operator disclaimer</w:t>
+      </w:r>
+      <w:r>
+        <w:t xml:space="preserve"> </w:t>
+      </w:r>
+      <w:r>
+        <w:t xml:space="preserve">(</w:t>
+      </w:r>
+      <w:r>
+        <w:rPr>
+          <w:rStyle w:val="VerbatimChar"/>
+        </w:rPr>
+        <w:t xml:space="preserve">pages/N78-Estimate.operator.html</w:t>
+      </w:r>
+      <w:r>
+        <w:t xml:space="preserve">) — https://nivo78.github.io/N78-Public-Legal/pages/N78-Estimate.operator.html</w:t>
+      </w:r>
+    </w:p>
+    <w:p>
+      <w:pPr>
+        <w:pStyle w:val="Compact"/>
+        <w:numPr>
+          <w:ilvl w:val="0"/>
+          <w:numId w:val="1002"/>
+        </w:numPr>
+      </w:pPr>
+      <w:r>
+        <w:rPr>
+          <w:b/>
+          <w:bCs/>
+        </w:rPr>
         <w:t xml:space="preserve">N78-Estimate — Privacy</w:t>
       </w:r>
       <w:r>
@@ -369,6 +772,130 @@
           <w:b/>
           <w:bCs/>
         </w:rPr>
+        <w:t xml:space="preserve">N78-FeatureLibrary — Operator disclaimer</w:t>
+      </w:r>
+      <w:r>
+        <w:t xml:space="preserve"> </w:t>
+      </w:r>
+      <w:r>
+        <w:t xml:space="preserve">(</w:t>
+      </w:r>
+      <w:r>
+        <w:rPr>
+          <w:rStyle w:val="VerbatimChar"/>
+        </w:rPr>
+        <w:t xml:space="preserve">pages/N78-FeatureLibrary.operator.html</w:t>
+      </w:r>
+      <w:r>
+        <w:t xml:space="preserve">) — https://nivo78.github.io/N78-Public-Legal/pages/N78-FeatureLibrary.operator.html</w:t>
+      </w:r>
+    </w:p>
+    <w:p>
+      <w:pPr>
+        <w:pStyle w:val="Compact"/>
+        <w:numPr>
+          <w:ilvl w:val="0"/>
+          <w:numId w:val="1002"/>
+        </w:numPr>
+      </w:pPr>
+      <w:r>
+        <w:rPr>
+          <w:b/>
+          <w:bCs/>
+        </w:rPr>
+        <w:t xml:space="preserve">N78-FeatureLibrary — Privacy</w:t>
+      </w:r>
+      <w:r>
+        <w:t xml:space="preserve"> </w:t>
+      </w:r>
+      <w:r>
+        <w:t xml:space="preserve">(</w:t>
+      </w:r>
+      <w:r>
+        <w:rPr>
+          <w:rStyle w:val="VerbatimChar"/>
+        </w:rPr>
+        <w:t xml:space="preserve">pages/N78-FeatureLibrary.privacy.html</w:t>
+      </w:r>
+      <w:r>
+        <w:t xml:space="preserve">) — https://nivo78.github.io/N78-Public-Legal/pages/N78-FeatureLibrary.privacy.html</w:t>
+      </w:r>
+    </w:p>
+    <w:p>
+      <w:pPr>
+        <w:pStyle w:val="Compact"/>
+        <w:numPr>
+          <w:ilvl w:val="0"/>
+          <w:numId w:val="1002"/>
+        </w:numPr>
+      </w:pPr>
+      <w:r>
+        <w:rPr>
+          <w:b/>
+          <w:bCs/>
+        </w:rPr>
+        <w:t xml:space="preserve">N78-FeatureLibrary — Terms</w:t>
+      </w:r>
+      <w:r>
+        <w:t xml:space="preserve"> </w:t>
+      </w:r>
+      <w:r>
+        <w:t xml:space="preserve">(</w:t>
+      </w:r>
+      <w:r>
+        <w:rPr>
+          <w:rStyle w:val="VerbatimChar"/>
+        </w:rPr>
+        <w:t xml:space="preserve">pages/N78-FeatureLibrary.terms.html</w:t>
+      </w:r>
+      <w:r>
+        <w:t xml:space="preserve">) — https://nivo78.github.io/N78-Public-Legal/pages/N78-FeatureLibrary.terms.html</w:t>
+      </w:r>
+    </w:p>
+    <w:p>
+      <w:pPr>
+        <w:pStyle w:val="Compact"/>
+        <w:numPr>
+          <w:ilvl w:val="0"/>
+          <w:numId w:val="1002"/>
+        </w:numPr>
+      </w:pPr>
+      <w:r>
+        <w:rPr>
+          <w:b/>
+          <w:bCs/>
+        </w:rPr>
+        <w:t xml:space="preserve">N78-Frame — Operator disclaimer</w:t>
+      </w:r>
+      <w:r>
+        <w:t xml:space="preserve"> </w:t>
+      </w:r>
+      <w:r>
+        <w:t xml:space="preserve">(</w:t>
+      </w:r>
+      <w:r>
+        <w:rPr>
+          <w:rStyle w:val="VerbatimChar"/>
+        </w:rPr>
+        <w:t xml:space="preserve">pages/N78-Frame.operator.html</w:t>
+      </w:r>
+      <w:r>
+        <w:t xml:space="preserve">) — https://nivo78.github.io/N78-Public-Legal/pages/N78-Frame.operator.html</w:t>
+      </w:r>
+    </w:p>
+    <w:p>
+      <w:pPr>
+        <w:pStyle w:val="Compact"/>
+        <w:numPr>
+          <w:ilvl w:val="0"/>
+          <w:numId w:val="1002"/>
+        </w:numPr>
+      </w:pPr>
+      <w:r>
+        <w:rPr>
+          <w:b/>
+          <w:bCs/>
+        </w:rPr>
         <w:t xml:space="preserve">N78-Frame — Privacy</w:t>
       </w:r>
       <w:r>
@@ -431,6 +958,37 @@
           <w:b/>
           <w:bCs/>
         </w:rPr>
+        <w:t xml:space="preserve">N78-Life — Operator disclaimer</w:t>
+      </w:r>
+      <w:r>
+        <w:t xml:space="preserve"> </w:t>
+      </w:r>
+      <w:r>
+        <w:t xml:space="preserve">(</w:t>
+      </w:r>
+      <w:r>
+        <w:rPr>
+          <w:rStyle w:val="VerbatimChar"/>
+        </w:rPr>
+        <w:t xml:space="preserve">pages/N78-Life.operator.html</w:t>
+      </w:r>
+      <w:r>
+        <w:t xml:space="preserve">) — https://nivo78.github.io/N78-Public-Legal/pages/N78-Life.operator.html</w:t>
+      </w:r>
+    </w:p>
+    <w:p>
+      <w:pPr>
+        <w:pStyle w:val="Compact"/>
+        <w:numPr>
+          <w:ilvl w:val="0"/>
+          <w:numId w:val="1002"/>
+        </w:numPr>
+      </w:pPr>
+      <w:r>
+        <w:rPr>
+          <w:b/>
+          <w:bCs/>
+        </w:rPr>
         <w:t xml:space="preserve">N78-Life — Privacy</w:t>
       </w:r>
       <w:r>
@@ -493,6 +1051,37 @@
           <w:b/>
           <w:bCs/>
         </w:rPr>
+        <w:t xml:space="preserve">N78-Machining — Operator disclaimer</w:t>
+      </w:r>
+      <w:r>
+        <w:t xml:space="preserve"> </w:t>
+      </w:r>
+      <w:r>
+        <w:t xml:space="preserve">(</w:t>
+      </w:r>
+      <w:r>
+        <w:rPr>
+          <w:rStyle w:val="VerbatimChar"/>
+        </w:rPr>
+        <w:t xml:space="preserve">pages/N78-Machining.operator.html</w:t>
+      </w:r>
+      <w:r>
+        <w:t xml:space="preserve">) — https://nivo78.github.io/N78-Public-Legal/pages/N78-Machining.operator.html</w:t>
+      </w:r>
+    </w:p>
+    <w:p>
+      <w:pPr>
+        <w:pStyle w:val="Compact"/>
+        <w:numPr>
+          <w:ilvl w:val="0"/>
+          <w:numId w:val="1002"/>
+        </w:numPr>
+      </w:pPr>
+      <w:r>
+        <w:rPr>
+          <w:b/>
+          <w:bCs/>
+        </w:rPr>
         <w:t xml:space="preserve">N78-Machining — Privacy</w:t>
       </w:r>
       <w:r>
@@ -555,6 +1144,37 @@
           <w:b/>
           <w:bCs/>
         </w:rPr>
+        <w:t xml:space="preserve">N78-Ops — Operator disclaimer</w:t>
+      </w:r>
+      <w:r>
+        <w:t xml:space="preserve"> </w:t>
+      </w:r>
+      <w:r>
+        <w:t xml:space="preserve">(</w:t>
+      </w:r>
+      <w:r>
+        <w:rPr>
+          <w:rStyle w:val="VerbatimChar"/>
+        </w:rPr>
+        <w:t xml:space="preserve">pages/N78-Ops.operator.html</w:t>
+      </w:r>
+      <w:r>
+        <w:t xml:space="preserve">) — https://nivo78.github.io/N78-Public-Legal/pages/N78-Ops.operator.html</w:t>
+      </w:r>
+    </w:p>
+    <w:p>
+      <w:pPr>
+        <w:pStyle w:val="Compact"/>
+        <w:numPr>
+          <w:ilvl w:val="0"/>
+          <w:numId w:val="1002"/>
+        </w:numPr>
+      </w:pPr>
+      <w:r>
+        <w:rPr>
+          <w:b/>
+          <w:bCs/>
+        </w:rPr>
         <w:t xml:space="preserve">N78-Ops — Privacy</w:t>
       </w:r>
       <w:r>
@@ -617,6 +1237,37 @@
           <w:b/>
           <w:bCs/>
         </w:rPr>
+        <w:t xml:space="preserve">N78-Probe — Operator disclaimer</w:t>
+      </w:r>
+      <w:r>
+        <w:t xml:space="preserve"> </w:t>
+      </w:r>
+      <w:r>
+        <w:t xml:space="preserve">(</w:t>
+      </w:r>
+      <w:r>
+        <w:rPr>
+          <w:rStyle w:val="VerbatimChar"/>
+        </w:rPr>
+        <w:t xml:space="preserve">pages/N78-Probe.operator.html</w:t>
+      </w:r>
+      <w:r>
+        <w:t xml:space="preserve">) — https://nivo78.github.io/N78-Public-Legal/pages/N78-Probe.operator.html</w:t>
+      </w:r>
+    </w:p>
+    <w:p>
+      <w:pPr>
+        <w:pStyle w:val="Compact"/>
+        <w:numPr>
+          <w:ilvl w:val="0"/>
+          <w:numId w:val="1002"/>
+        </w:numPr>
+      </w:pPr>
+      <w:r>
+        <w:rPr>
+          <w:b/>
+          <w:bCs/>
+        </w:rPr>
         <w:t xml:space="preserve">N78-Probe — Privacy</w:t>
       </w:r>
       <w:r>
@@ -679,6 +1330,316 @@
           <w:b/>
           <w:bCs/>
         </w:rPr>
+        <w:t xml:space="preserve">N78-QRTest — Operator disclaimer</w:t>
+      </w:r>
+      <w:r>
+        <w:t xml:space="preserve"> </w:t>
+      </w:r>
+      <w:r>
+        <w:t xml:space="preserve">(</w:t>
+      </w:r>
+      <w:r>
+        <w:rPr>
+          <w:rStyle w:val="VerbatimChar"/>
+        </w:rPr>
+        <w:t xml:space="preserve">pages/N78-QRTest.operator.html</w:t>
+      </w:r>
+      <w:r>
+        <w:t xml:space="preserve">) — https://nivo78.github.io/N78-Public-Legal/pages/N78-QRTest.operator.html</w:t>
+      </w:r>
+    </w:p>
+    <w:p>
+      <w:pPr>
+        <w:pStyle w:val="Compact"/>
+        <w:numPr>
+          <w:ilvl w:val="0"/>
+          <w:numId w:val="1002"/>
+        </w:numPr>
+      </w:pPr>
+      <w:r>
+        <w:rPr>
+          <w:b/>
+          <w:bCs/>
+        </w:rPr>
+        <w:t xml:space="preserve">N78-QRTest — Privacy</w:t>
+      </w:r>
+      <w:r>
+        <w:t xml:space="preserve"> </w:t>
+      </w:r>
+      <w:r>
+        <w:t xml:space="preserve">(</w:t>
+      </w:r>
+      <w:r>
+        <w:rPr>
+          <w:rStyle w:val="VerbatimChar"/>
+        </w:rPr>
+        <w:t xml:space="preserve">pages/N78-QRTest.privacy.html</w:t>
+      </w:r>
+      <w:r>
+        <w:t xml:space="preserve">) — https://nivo78.github.io/N78-Public-Legal/pages/N78-QRTest.privacy.html</w:t>
+      </w:r>
+    </w:p>
+    <w:p>
+      <w:pPr>
+        <w:pStyle w:val="Compact"/>
+        <w:numPr>
+          <w:ilvl w:val="0"/>
+          <w:numId w:val="1002"/>
+        </w:numPr>
+      </w:pPr>
+      <w:r>
+        <w:rPr>
+          <w:b/>
+          <w:bCs/>
+        </w:rPr>
+        <w:t xml:space="preserve">N78-QRTest — Terms</w:t>
+      </w:r>
+      <w:r>
+        <w:t xml:space="preserve"> </w:t>
+      </w:r>
+      <w:r>
+        <w:t xml:space="preserve">(</w:t>
+      </w:r>
+      <w:r>
+        <w:rPr>
+          <w:rStyle w:val="VerbatimChar"/>
+        </w:rPr>
+        <w:t xml:space="preserve">pages/N78-QRTest.terms.html</w:t>
+      </w:r>
+      <w:r>
+        <w:t xml:space="preserve">) — https://nivo78.github.io/N78-Public-Legal/pages/N78-QRTest.terms.html</w:t>
+      </w:r>
+    </w:p>
+    <w:p>
+      <w:pPr>
+        <w:pStyle w:val="Compact"/>
+        <w:numPr>
+          <w:ilvl w:val="0"/>
+          <w:numId w:val="1002"/>
+        </w:numPr>
+      </w:pPr>
+      <w:r>
+        <w:rPr>
+          <w:b/>
+          <w:bCs/>
+        </w:rPr>
+        <w:t xml:space="preserve">N78-Standards — Operator disclaimer</w:t>
+      </w:r>
+      <w:r>
+        <w:t xml:space="preserve"> </w:t>
+      </w:r>
+      <w:r>
+        <w:t xml:space="preserve">(</w:t>
+      </w:r>
+      <w:r>
+        <w:rPr>
+          <w:rStyle w:val="VerbatimChar"/>
+        </w:rPr>
+        <w:t xml:space="preserve">pages/N78-Standards.operator.html</w:t>
+      </w:r>
+      <w:r>
+        <w:t xml:space="preserve">) — https://nivo78.github.io/N78-Public-Legal/pages/N78-Standards.operator.html</w:t>
+      </w:r>
+    </w:p>
+    <w:p>
+      <w:pPr>
+        <w:pStyle w:val="Compact"/>
+        <w:numPr>
+          <w:ilvl w:val="0"/>
+          <w:numId w:val="1002"/>
+        </w:numPr>
+      </w:pPr>
+      <w:r>
+        <w:rPr>
+          <w:b/>
+          <w:bCs/>
+        </w:rPr>
+        <w:t xml:space="preserve">N78-Standards — Privacy</w:t>
+      </w:r>
+      <w:r>
+        <w:t xml:space="preserve"> </w:t>
+      </w:r>
+      <w:r>
+        <w:t xml:space="preserve">(</w:t>
+      </w:r>
+      <w:r>
+        <w:rPr>
+          <w:rStyle w:val="VerbatimChar"/>
+        </w:rPr>
+        <w:t xml:space="preserve">pages/N78-Standards.privacy.html</w:t>
+      </w:r>
+      <w:r>
+        <w:t xml:space="preserve">) — https://nivo78.github.io/N78-Public-Legal/pages/N78-Standards.privacy.html</w:t>
+      </w:r>
+    </w:p>
+    <w:p>
+      <w:pPr>
+        <w:pStyle w:val="Compact"/>
+        <w:numPr>
+          <w:ilvl w:val="0"/>
+          <w:numId w:val="1002"/>
+        </w:numPr>
+      </w:pPr>
+      <w:r>
+        <w:rPr>
+          <w:b/>
+          <w:bCs/>
+        </w:rPr>
+        <w:t xml:space="preserve">N78-Standards — Terms</w:t>
+      </w:r>
+      <w:r>
+        <w:t xml:space="preserve"> </w:t>
+      </w:r>
+      <w:r>
+        <w:t xml:space="preserve">(</w:t>
+      </w:r>
+      <w:r>
+        <w:rPr>
+          <w:rStyle w:val="VerbatimChar"/>
+        </w:rPr>
+        <w:t xml:space="preserve">pages/N78-Standards.terms.html</w:t>
+      </w:r>
+      <w:r>
+        <w:t xml:space="preserve">) — https://nivo78.github.io/N78-Public-Legal/pages/N78-Standards.terms.html</w:t>
+      </w:r>
+    </w:p>
+    <w:p>
+      <w:pPr>
+        <w:pStyle w:val="Compact"/>
+        <w:numPr>
+          <w:ilvl w:val="0"/>
+          <w:numId w:val="1002"/>
+        </w:numPr>
+      </w:pPr>
+      <w:r>
+        <w:rPr>
+          <w:b/>
+          <w:bCs/>
+        </w:rPr>
+        <w:t xml:space="preserve">N78-Template — Operator disclaimer</w:t>
+      </w:r>
+      <w:r>
+        <w:t xml:space="preserve"> </w:t>
+      </w:r>
+      <w:r>
+        <w:t xml:space="preserve">(</w:t>
+      </w:r>
+      <w:r>
+        <w:rPr>
+          <w:rStyle w:val="VerbatimChar"/>
+        </w:rPr>
+        <w:t xml:space="preserve">pages/N78-Template.operator.html</w:t>
+      </w:r>
+      <w:r>
+        <w:t xml:space="preserve">) — https://nivo78.github.io/N78-Public-Legal/pages/N78-Template.operator.html</w:t>
+      </w:r>
+    </w:p>
+    <w:p>
+      <w:pPr>
+        <w:pStyle w:val="Compact"/>
+        <w:numPr>
+          <w:ilvl w:val="0"/>
+          <w:numId w:val="1002"/>
+        </w:numPr>
+      </w:pPr>
+      <w:r>
+        <w:rPr>
+          <w:b/>
+          <w:bCs/>
+        </w:rPr>
+        <w:t xml:space="preserve">N78-Template — Privacy</w:t>
+      </w:r>
+      <w:r>
+        <w:t xml:space="preserve"> </w:t>
+      </w:r>
+      <w:r>
+        <w:t xml:space="preserve">(</w:t>
+      </w:r>
+      <w:r>
+        <w:rPr>
+          <w:rStyle w:val="VerbatimChar"/>
+        </w:rPr>
+        <w:t xml:space="preserve">pages/N78-Template.privacy.html</w:t>
+      </w:r>
+      <w:r>
+        <w:t xml:space="preserve">) — https://nivo78.github.io/N78-Public-Legal/pages/N78-Template.privacy.html</w:t>
+      </w:r>
+    </w:p>
+    <w:p>
+      <w:pPr>
+        <w:pStyle w:val="Compact"/>
+        <w:numPr>
+          <w:ilvl w:val="0"/>
+          <w:numId w:val="1002"/>
+        </w:numPr>
+      </w:pPr>
+      <w:r>
+        <w:rPr>
+          <w:b/>
+          <w:bCs/>
+        </w:rPr>
+        <w:t xml:space="preserve">N78-Template — Terms</w:t>
+      </w:r>
+      <w:r>
+        <w:t xml:space="preserve"> </w:t>
+      </w:r>
+      <w:r>
+        <w:t xml:space="preserve">(</w:t>
+      </w:r>
+      <w:r>
+        <w:rPr>
+          <w:rStyle w:val="VerbatimChar"/>
+        </w:rPr>
+        <w:t xml:space="preserve">pages/N78-Template.terms.html</w:t>
+      </w:r>
+      <w:r>
+        <w:t xml:space="preserve">) — https://nivo78.github.io/N78-Public-Legal/pages/N78-Template.terms.html</w:t>
+      </w:r>
+    </w:p>
+    <w:p>
+      <w:pPr>
+        <w:pStyle w:val="Compact"/>
+        <w:numPr>
+          <w:ilvl w:val="0"/>
+          <w:numId w:val="1002"/>
+        </w:numPr>
+      </w:pPr>
+      <w:r>
+        <w:rPr>
+          <w:b/>
+          <w:bCs/>
+        </w:rPr>
+        <w:t xml:space="preserve">N78-ThinStl — Operator disclaimer</w:t>
+      </w:r>
+      <w:r>
+        <w:t xml:space="preserve"> </w:t>
+      </w:r>
+      <w:r>
+        <w:t xml:space="preserve">(</w:t>
+      </w:r>
+      <w:r>
+        <w:rPr>
+          <w:rStyle w:val="VerbatimChar"/>
+        </w:rPr>
+        <w:t xml:space="preserve">pages/N78-ThinStl.operator.html</w:t>
+      </w:r>
+      <w:r>
+        <w:t xml:space="preserve">) — https://nivo78.github.io/N78-Public-Legal/pages/N78-ThinStl.operator.html</w:t>
+      </w:r>
+    </w:p>
+    <w:p>
+      <w:pPr>
+        <w:pStyle w:val="Compact"/>
+        <w:numPr>
+          <w:ilvl w:val="0"/>
+          <w:numId w:val="1002"/>
+        </w:numPr>
+      </w:pPr>
+      <w:r>
+        <w:rPr>
+          <w:b/>
+          <w:bCs/>
+        </w:rPr>
         <w:t xml:space="preserve">N78-ThinStl — Privacy</w:t>
       </w:r>
       <w:r>
@@ -741,6 +1702,37 @@
           <w:b/>
           <w:bCs/>
         </w:rPr>
+        <w:t xml:space="preserve">N78-Track — Operator disclaimer</w:t>
+      </w:r>
+      <w:r>
+        <w:t xml:space="preserve"> </w:t>
+      </w:r>
+      <w:r>
+        <w:t xml:space="preserve">(</w:t>
+      </w:r>
+      <w:r>
+        <w:rPr>
+          <w:rStyle w:val="VerbatimChar"/>
+        </w:rPr>
+        <w:t xml:space="preserve">pages/N78-Track.operator.html</w:t>
+      </w:r>
+      <w:r>
+        <w:t xml:space="preserve">) — https://nivo78.github.io/N78-Public-Legal/pages/N78-Track.operator.html</w:t>
+      </w:r>
+    </w:p>
+    <w:p>
+      <w:pPr>
+        <w:pStyle w:val="Compact"/>
+        <w:numPr>
+          <w:ilvl w:val="0"/>
+          <w:numId w:val="1002"/>
+        </w:numPr>
+      </w:pPr>
+      <w:r>
+        <w:rPr>
+          <w:b/>
+          <w:bCs/>
+        </w:rPr>
         <w:t xml:space="preserve">N78-Track — Privacy</w:t>
       </w:r>
       <w:r>
@@ -788,6 +1780,99 @@
       </w:r>
       <w:r>
         <w:t xml:space="preserve">) — https://nivo78.github.io/N78-Public-Legal/pages/N78-Track.terms.html</w:t>
+      </w:r>
+    </w:p>
+    <w:p>
+      <w:pPr>
+        <w:pStyle w:val="Compact"/>
+        <w:numPr>
+          <w:ilvl w:val="0"/>
+          <w:numId w:val="1002"/>
+        </w:numPr>
+      </w:pPr>
+      <w:r>
+        <w:rPr>
+          <w:b/>
+          <w:bCs/>
+        </w:rPr>
+        <w:t xml:space="preserve">Successor — Operator disclaimer</w:t>
+      </w:r>
+      <w:r>
+        <w:t xml:space="preserve"> </w:t>
+      </w:r>
+      <w:r>
+        <w:t xml:space="preserve">(</w:t>
+      </w:r>
+      <w:r>
+        <w:rPr>
+          <w:rStyle w:val="VerbatimChar"/>
+        </w:rPr>
+        <w:t xml:space="preserve">pages/Successor.operator.html</w:t>
+      </w:r>
+      <w:r>
+        <w:t xml:space="preserve">) — https://nivo78.github.io/N78-Public-Legal/pages/Successor.operator.html</w:t>
+      </w:r>
+    </w:p>
+    <w:p>
+      <w:pPr>
+        <w:pStyle w:val="Compact"/>
+        <w:numPr>
+          <w:ilvl w:val="0"/>
+          <w:numId w:val="1002"/>
+        </w:numPr>
+      </w:pPr>
+      <w:r>
+        <w:rPr>
+          <w:b/>
+          <w:bCs/>
+        </w:rPr>
+        <w:t xml:space="preserve">Successor — Privacy</w:t>
+      </w:r>
+      <w:r>
+        <w:t xml:space="preserve"> </w:t>
+      </w:r>
+      <w:r>
+        <w:t xml:space="preserve">(</w:t>
+      </w:r>
+      <w:r>
+        <w:rPr>
+          <w:rStyle w:val="VerbatimChar"/>
+        </w:rPr>
+        <w:t xml:space="preserve">pages/Successor.privacy.html</w:t>
+      </w:r>
+      <w:r>
+        <w:t xml:space="preserve">) — https://nivo78.github.io/N78-Public-Legal/pages/Successor.privacy.html</w:t>
+      </w:r>
+    </w:p>
+    <w:p>
+      <w:pPr>
+        <w:pStyle w:val="Compact"/>
+        <w:numPr>
+          <w:ilvl w:val="0"/>
+          <w:numId w:val="1002"/>
+        </w:numPr>
+      </w:pPr>
+      <w:r>
+        <w:rPr>
+          <w:b/>
+          <w:bCs/>
+        </w:rPr>
+        <w:t xml:space="preserve">Successor — Terms</w:t>
+      </w:r>
+      <w:r>
+        <w:t xml:space="preserve"> </w:t>
+      </w:r>
+      <w:r>
+        <w:t xml:space="preserve">(</w:t>
+      </w:r>
+      <w:r>
+        <w:rPr>
+          <w:rStyle w:val="VerbatimChar"/>
+        </w:rPr>
+        <w:t xml:space="preserve">pages/Successor.terms.html</w:t>
+      </w:r>
+      <w:r>
+        <w:t xml:space="preserve">) — https://nivo78.github.io/N78-Public-Legal/pages/Successor.terms.html</w:t>
       </w:r>
     </w:p>
     <w:bookmarkEnd w:id="10"/>

</xml_diff>

<commit_message>
updocs: sync N78-Ops privacy and terms pages from app assets.
</commit_message>
<xml_diff>
--- a/docs/Legal URL.docx
+++ b/docs/Legal URL.docx
@@ -16,7 +16,7 @@
         <w:pStyle w:val="FirstParagraph"/>
       </w:pPr>
       <w:r>
-        <w:t xml:space="preserve">Generated: October 4, 2026</w:t>
+        <w:t xml:space="preserve">Generated: October 7, 2026</w:t>
       </w:r>
     </w:p>
     <w:p>
@@ -64,7 +64,7 @@
         <w:t xml:space="preserve"> </w:t>
       </w:r>
       <w:r>
-        <w:t xml:space="preserve">— https://nivo78.github.io/N78-Public-Legal/index.html</w:t>
+        <w:t xml:space="preserve">- https://nivo78.github.io/N78-Public-Legal/index.html</w:t>
       </w:r>
     </w:p>
     <w:p>
@@ -86,7 +86,7 @@
         <w:t xml:space="preserve"> </w:t>
       </w:r>
       <w:r>
-        <w:t xml:space="preserve">— https://nivo78.github.io/N78-Public-Legal/legal.css</w:t>
+        <w:t xml:space="preserve">- https://nivo78.github.io/N78-Public-Legal/legal.css</w:t>
       </w:r>
     </w:p>
     <w:bookmarkEnd w:id="9"/>
@@ -121,7 +121,7 @@
           <w:b/>
           <w:bCs/>
         </w:rPr>
-        <w:t xml:space="preserve">Integrator — Operator disclaimer</w:t>
+        <w:t xml:space="preserve">Integrator - Operator disclaimer</w:t>
       </w:r>
       <w:r>
         <w:t xml:space="preserve"> </w:t>
@@ -136,23 +136,23 @@
         <w:t xml:space="preserve">pages/Integrator.operator.html</w:t>
       </w:r>
       <w:r>
-        <w:t xml:space="preserve">) — https://nivo78.github.io/N78-Public-Legal/pages/Integrator.operator.html</w:t>
-      </w:r>
-    </w:p>
-    <w:p>
-      <w:pPr>
-        <w:pStyle w:val="Compact"/>
-        <w:numPr>
-          <w:ilvl w:val="0"/>
-          <w:numId w:val="1002"/>
-        </w:numPr>
-      </w:pPr>
-      <w:r>
-        <w:rPr>
-          <w:b/>
-          <w:bCs/>
-        </w:rPr>
-        <w:t xml:space="preserve">Integrator — Privacy</w:t>
+        <w:t xml:space="preserve">) - https://nivo78.github.io/N78-Public-Legal/pages/Integrator.operator.html</w:t>
+      </w:r>
+    </w:p>
+    <w:p>
+      <w:pPr>
+        <w:pStyle w:val="Compact"/>
+        <w:numPr>
+          <w:ilvl w:val="0"/>
+          <w:numId w:val="1002"/>
+        </w:numPr>
+      </w:pPr>
+      <w:r>
+        <w:rPr>
+          <w:b/>
+          <w:bCs/>
+        </w:rPr>
+        <w:t xml:space="preserve">Integrator - Privacy</w:t>
       </w:r>
       <w:r>
         <w:t xml:space="preserve"> </w:t>
@@ -167,23 +167,23 @@
         <w:t xml:space="preserve">pages/Integrator.privacy.html</w:t>
       </w:r>
       <w:r>
-        <w:t xml:space="preserve">) — https://nivo78.github.io/N78-Public-Legal/pages/Integrator.privacy.html</w:t>
-      </w:r>
-    </w:p>
-    <w:p>
-      <w:pPr>
-        <w:pStyle w:val="Compact"/>
-        <w:numPr>
-          <w:ilvl w:val="0"/>
-          <w:numId w:val="1002"/>
-        </w:numPr>
-      </w:pPr>
-      <w:r>
-        <w:rPr>
-          <w:b/>
-          <w:bCs/>
-        </w:rPr>
-        <w:t xml:space="preserve">Integrator — Terms</w:t>
+        <w:t xml:space="preserve">) - https://nivo78.github.io/N78-Public-Legal/pages/Integrator.privacy.html</w:t>
+      </w:r>
+    </w:p>
+    <w:p>
+      <w:pPr>
+        <w:pStyle w:val="Compact"/>
+        <w:numPr>
+          <w:ilvl w:val="0"/>
+          <w:numId w:val="1002"/>
+        </w:numPr>
+      </w:pPr>
+      <w:r>
+        <w:rPr>
+          <w:b/>
+          <w:bCs/>
+        </w:rPr>
+        <w:t xml:space="preserve">Integrator - Terms</w:t>
       </w:r>
       <w:r>
         <w:t xml:space="preserve"> </w:t>
@@ -198,23 +198,23 @@
         <w:t xml:space="preserve">pages/Integrator.terms.html</w:t>
       </w:r>
       <w:r>
-        <w:t xml:space="preserve">) — https://nivo78.github.io/N78-Public-Legal/pages/Integrator.terms.html</w:t>
-      </w:r>
-    </w:p>
-    <w:p>
-      <w:pPr>
-        <w:pStyle w:val="Compact"/>
-        <w:numPr>
-          <w:ilvl w:val="0"/>
-          <w:numId w:val="1002"/>
-        </w:numPr>
-      </w:pPr>
-      <w:r>
-        <w:rPr>
-          <w:b/>
-          <w:bCs/>
-        </w:rPr>
-        <w:t xml:space="preserve">N78-APA — Operator disclaimer</w:t>
+        <w:t xml:space="preserve">) - https://nivo78.github.io/N78-Public-Legal/pages/Integrator.terms.html</w:t>
+      </w:r>
+    </w:p>
+    <w:p>
+      <w:pPr>
+        <w:pStyle w:val="Compact"/>
+        <w:numPr>
+          <w:ilvl w:val="0"/>
+          <w:numId w:val="1002"/>
+        </w:numPr>
+      </w:pPr>
+      <w:r>
+        <w:rPr>
+          <w:b/>
+          <w:bCs/>
+        </w:rPr>
+        <w:t xml:space="preserve">N78-APA - Operator disclaimer</w:t>
       </w:r>
       <w:r>
         <w:t xml:space="preserve"> </w:t>
@@ -229,23 +229,23 @@
         <w:t xml:space="preserve">pages/N78-APA.operator.html</w:t>
       </w:r>
       <w:r>
-        <w:t xml:space="preserve">) — https://nivo78.github.io/N78-Public-Legal/pages/N78-APA.operator.html</w:t>
-      </w:r>
-    </w:p>
-    <w:p>
-      <w:pPr>
-        <w:pStyle w:val="Compact"/>
-        <w:numPr>
-          <w:ilvl w:val="0"/>
-          <w:numId w:val="1002"/>
-        </w:numPr>
-      </w:pPr>
-      <w:r>
-        <w:rPr>
-          <w:b/>
-          <w:bCs/>
-        </w:rPr>
-        <w:t xml:space="preserve">N78-APA — Privacy</w:t>
+        <w:t xml:space="preserve">) - https://nivo78.github.io/N78-Public-Legal/pages/N78-APA.operator.html</w:t>
+      </w:r>
+    </w:p>
+    <w:p>
+      <w:pPr>
+        <w:pStyle w:val="Compact"/>
+        <w:numPr>
+          <w:ilvl w:val="0"/>
+          <w:numId w:val="1002"/>
+        </w:numPr>
+      </w:pPr>
+      <w:r>
+        <w:rPr>
+          <w:b/>
+          <w:bCs/>
+        </w:rPr>
+        <w:t xml:space="preserve">N78-APA - Privacy</w:t>
       </w:r>
       <w:r>
         <w:t xml:space="preserve"> </w:t>
@@ -260,23 +260,23 @@
         <w:t xml:space="preserve">pages/N78-APA.privacy.html</w:t>
       </w:r>
       <w:r>
-        <w:t xml:space="preserve">) — https://nivo78.github.io/N78-Public-Legal/pages/N78-APA.privacy.html</w:t>
-      </w:r>
-    </w:p>
-    <w:p>
-      <w:pPr>
-        <w:pStyle w:val="Compact"/>
-        <w:numPr>
-          <w:ilvl w:val="0"/>
-          <w:numId w:val="1002"/>
-        </w:numPr>
-      </w:pPr>
-      <w:r>
-        <w:rPr>
-          <w:b/>
-          <w:bCs/>
-        </w:rPr>
-        <w:t xml:space="preserve">N78-APA — Terms</w:t>
+        <w:t xml:space="preserve">) - https://nivo78.github.io/N78-Public-Legal/pages/N78-APA.privacy.html</w:t>
+      </w:r>
+    </w:p>
+    <w:p>
+      <w:pPr>
+        <w:pStyle w:val="Compact"/>
+        <w:numPr>
+          <w:ilvl w:val="0"/>
+          <w:numId w:val="1002"/>
+        </w:numPr>
+      </w:pPr>
+      <w:r>
+        <w:rPr>
+          <w:b/>
+          <w:bCs/>
+        </w:rPr>
+        <w:t xml:space="preserve">N78-APA - Terms</w:t>
       </w:r>
       <w:r>
         <w:t xml:space="preserve"> </w:t>
@@ -291,23 +291,23 @@
         <w:t xml:space="preserve">pages/N78-APA.terms.html</w:t>
       </w:r>
       <w:r>
-        <w:t xml:space="preserve">) — https://nivo78.github.io/N78-Public-Legal/pages/N78-APA.terms.html</w:t>
-      </w:r>
-    </w:p>
-    <w:p>
-      <w:pPr>
-        <w:pStyle w:val="Compact"/>
-        <w:numPr>
-          <w:ilvl w:val="0"/>
-          <w:numId w:val="1002"/>
-        </w:numPr>
-      </w:pPr>
-      <w:r>
-        <w:rPr>
-          <w:b/>
-          <w:bCs/>
-        </w:rPr>
-        <w:t xml:space="preserve">N78-BizBlocks — Operator disclaimer</w:t>
+        <w:t xml:space="preserve">) - https://nivo78.github.io/N78-Public-Legal/pages/N78-APA.terms.html</w:t>
+      </w:r>
+    </w:p>
+    <w:p>
+      <w:pPr>
+        <w:pStyle w:val="Compact"/>
+        <w:numPr>
+          <w:ilvl w:val="0"/>
+          <w:numId w:val="1002"/>
+        </w:numPr>
+      </w:pPr>
+      <w:r>
+        <w:rPr>
+          <w:b/>
+          <w:bCs/>
+        </w:rPr>
+        <w:t xml:space="preserve">N78-BizBlocks - Operator disclaimer</w:t>
       </w:r>
       <w:r>
         <w:t xml:space="preserve"> </w:t>
@@ -322,23 +322,23 @@
         <w:t xml:space="preserve">pages/N78-BizBlocks.operator.html</w:t>
       </w:r>
       <w:r>
-        <w:t xml:space="preserve">) — https://nivo78.github.io/N78-Public-Legal/pages/N78-BizBlocks.operator.html</w:t>
-      </w:r>
-    </w:p>
-    <w:p>
-      <w:pPr>
-        <w:pStyle w:val="Compact"/>
-        <w:numPr>
-          <w:ilvl w:val="0"/>
-          <w:numId w:val="1002"/>
-        </w:numPr>
-      </w:pPr>
-      <w:r>
-        <w:rPr>
-          <w:b/>
-          <w:bCs/>
-        </w:rPr>
-        <w:t xml:space="preserve">N78-BizBlocks — Privacy</w:t>
+        <w:t xml:space="preserve">) - https://nivo78.github.io/N78-Public-Legal/pages/N78-BizBlocks.operator.html</w:t>
+      </w:r>
+    </w:p>
+    <w:p>
+      <w:pPr>
+        <w:pStyle w:val="Compact"/>
+        <w:numPr>
+          <w:ilvl w:val="0"/>
+          <w:numId w:val="1002"/>
+        </w:numPr>
+      </w:pPr>
+      <w:r>
+        <w:rPr>
+          <w:b/>
+          <w:bCs/>
+        </w:rPr>
+        <w:t xml:space="preserve">N78-BizBlocks - Privacy</w:t>
       </w:r>
       <w:r>
         <w:t xml:space="preserve"> </w:t>
@@ -353,23 +353,23 @@
         <w:t xml:space="preserve">pages/N78-BizBlocks.privacy.html</w:t>
       </w:r>
       <w:r>
-        <w:t xml:space="preserve">) — https://nivo78.github.io/N78-Public-Legal/pages/N78-BizBlocks.privacy.html</w:t>
-      </w:r>
-    </w:p>
-    <w:p>
-      <w:pPr>
-        <w:pStyle w:val="Compact"/>
-        <w:numPr>
-          <w:ilvl w:val="0"/>
-          <w:numId w:val="1002"/>
-        </w:numPr>
-      </w:pPr>
-      <w:r>
-        <w:rPr>
-          <w:b/>
-          <w:bCs/>
-        </w:rPr>
-        <w:t xml:space="preserve">N78-BizBlocks — Terms</w:t>
+        <w:t xml:space="preserve">) - https://nivo78.github.io/N78-Public-Legal/pages/N78-BizBlocks.privacy.html</w:t>
+      </w:r>
+    </w:p>
+    <w:p>
+      <w:pPr>
+        <w:pStyle w:val="Compact"/>
+        <w:numPr>
+          <w:ilvl w:val="0"/>
+          <w:numId w:val="1002"/>
+        </w:numPr>
+      </w:pPr>
+      <w:r>
+        <w:rPr>
+          <w:b/>
+          <w:bCs/>
+        </w:rPr>
+        <w:t xml:space="preserve">N78-BizBlocks - Terms</w:t>
       </w:r>
       <w:r>
         <w:t xml:space="preserve"> </w:t>
@@ -384,23 +384,23 @@
         <w:t xml:space="preserve">pages/N78-BizBlocks.terms.html</w:t>
       </w:r>
       <w:r>
-        <w:t xml:space="preserve">) — https://nivo78.github.io/N78-Public-Legal/pages/N78-BizBlocks.terms.html</w:t>
-      </w:r>
-    </w:p>
-    <w:p>
-      <w:pPr>
-        <w:pStyle w:val="Compact"/>
-        <w:numPr>
-          <w:ilvl w:val="0"/>
-          <w:numId w:val="1002"/>
-        </w:numPr>
-      </w:pPr>
-      <w:r>
-        <w:rPr>
-          <w:b/>
-          <w:bCs/>
-        </w:rPr>
-        <w:t xml:space="preserve">N78-Book — Operator disclaimer</w:t>
+        <w:t xml:space="preserve">) - https://nivo78.github.io/N78-Public-Legal/pages/N78-BizBlocks.terms.html</w:t>
+      </w:r>
+    </w:p>
+    <w:p>
+      <w:pPr>
+        <w:pStyle w:val="Compact"/>
+        <w:numPr>
+          <w:ilvl w:val="0"/>
+          <w:numId w:val="1002"/>
+        </w:numPr>
+      </w:pPr>
+      <w:r>
+        <w:rPr>
+          <w:b/>
+          <w:bCs/>
+        </w:rPr>
+        <w:t xml:space="preserve">N78-Book - Operator disclaimer</w:t>
       </w:r>
       <w:r>
         <w:t xml:space="preserve"> </w:t>
@@ -415,23 +415,23 @@
         <w:t xml:space="preserve">pages/N78-Book.operator.html</w:t>
       </w:r>
       <w:r>
-        <w:t xml:space="preserve">) — https://nivo78.github.io/N78-Public-Legal/pages/N78-Book.operator.html</w:t>
-      </w:r>
-    </w:p>
-    <w:p>
-      <w:pPr>
-        <w:pStyle w:val="Compact"/>
-        <w:numPr>
-          <w:ilvl w:val="0"/>
-          <w:numId w:val="1002"/>
-        </w:numPr>
-      </w:pPr>
-      <w:r>
-        <w:rPr>
-          <w:b/>
-          <w:bCs/>
-        </w:rPr>
-        <w:t xml:space="preserve">N78-Book — Privacy</w:t>
+        <w:t xml:space="preserve">) - https://nivo78.github.io/N78-Public-Legal/pages/N78-Book.operator.html</w:t>
+      </w:r>
+    </w:p>
+    <w:p>
+      <w:pPr>
+        <w:pStyle w:val="Compact"/>
+        <w:numPr>
+          <w:ilvl w:val="0"/>
+          <w:numId w:val="1002"/>
+        </w:numPr>
+      </w:pPr>
+      <w:r>
+        <w:rPr>
+          <w:b/>
+          <w:bCs/>
+        </w:rPr>
+        <w:t xml:space="preserve">N78-Book - Privacy</w:t>
       </w:r>
       <w:r>
         <w:t xml:space="preserve"> </w:t>
@@ -446,23 +446,23 @@
         <w:t xml:space="preserve">pages/N78-Book.privacy.html</w:t>
       </w:r>
       <w:r>
-        <w:t xml:space="preserve">) — https://nivo78.github.io/N78-Public-Legal/pages/N78-Book.privacy.html</w:t>
-      </w:r>
-    </w:p>
-    <w:p>
-      <w:pPr>
-        <w:pStyle w:val="Compact"/>
-        <w:numPr>
-          <w:ilvl w:val="0"/>
-          <w:numId w:val="1002"/>
-        </w:numPr>
-      </w:pPr>
-      <w:r>
-        <w:rPr>
-          <w:b/>
-          <w:bCs/>
-        </w:rPr>
-        <w:t xml:space="preserve">N78-Book — Terms</w:t>
+        <w:t xml:space="preserve">) - https://nivo78.github.io/N78-Public-Legal/pages/N78-Book.privacy.html</w:t>
+      </w:r>
+    </w:p>
+    <w:p>
+      <w:pPr>
+        <w:pStyle w:val="Compact"/>
+        <w:numPr>
+          <w:ilvl w:val="0"/>
+          <w:numId w:val="1002"/>
+        </w:numPr>
+      </w:pPr>
+      <w:r>
+        <w:rPr>
+          <w:b/>
+          <w:bCs/>
+        </w:rPr>
+        <w:t xml:space="preserve">N78-Book - Terms</w:t>
       </w:r>
       <w:r>
         <w:t xml:space="preserve"> </w:t>
@@ -477,23 +477,23 @@
         <w:t xml:space="preserve">pages/N78-Book.terms.html</w:t>
       </w:r>
       <w:r>
-        <w:t xml:space="preserve">) — https://nivo78.github.io/N78-Public-Legal/pages/N78-Book.terms.html</w:t>
-      </w:r>
-    </w:p>
-    <w:p>
-      <w:pPr>
-        <w:pStyle w:val="Compact"/>
-        <w:numPr>
-          <w:ilvl w:val="0"/>
-          <w:numId w:val="1002"/>
-        </w:numPr>
-      </w:pPr>
-      <w:r>
-        <w:rPr>
-          <w:b/>
-          <w:bCs/>
-        </w:rPr>
-        <w:t xml:space="preserve">N78-Dash — Operator disclaimer</w:t>
+        <w:t xml:space="preserve">) - https://nivo78.github.io/N78-Public-Legal/pages/N78-Book.terms.html</w:t>
+      </w:r>
+    </w:p>
+    <w:p>
+      <w:pPr>
+        <w:pStyle w:val="Compact"/>
+        <w:numPr>
+          <w:ilvl w:val="0"/>
+          <w:numId w:val="1002"/>
+        </w:numPr>
+      </w:pPr>
+      <w:r>
+        <w:rPr>
+          <w:b/>
+          <w:bCs/>
+        </w:rPr>
+        <w:t xml:space="preserve">N78-Dash - Operator disclaimer</w:t>
       </w:r>
       <w:r>
         <w:t xml:space="preserve"> </w:t>
@@ -508,23 +508,23 @@
         <w:t xml:space="preserve">pages/N78-Dash.operator.html</w:t>
       </w:r>
       <w:r>
-        <w:t xml:space="preserve">) — https://nivo78.github.io/N78-Public-Legal/pages/N78-Dash.operator.html</w:t>
-      </w:r>
-    </w:p>
-    <w:p>
-      <w:pPr>
-        <w:pStyle w:val="Compact"/>
-        <w:numPr>
-          <w:ilvl w:val="0"/>
-          <w:numId w:val="1002"/>
-        </w:numPr>
-      </w:pPr>
-      <w:r>
-        <w:rPr>
-          <w:b/>
-          <w:bCs/>
-        </w:rPr>
-        <w:t xml:space="preserve">N78-Dash — Privacy</w:t>
+        <w:t xml:space="preserve">) - https://nivo78.github.io/N78-Public-Legal/pages/N78-Dash.operator.html</w:t>
+      </w:r>
+    </w:p>
+    <w:p>
+      <w:pPr>
+        <w:pStyle w:val="Compact"/>
+        <w:numPr>
+          <w:ilvl w:val="0"/>
+          <w:numId w:val="1002"/>
+        </w:numPr>
+      </w:pPr>
+      <w:r>
+        <w:rPr>
+          <w:b/>
+          <w:bCs/>
+        </w:rPr>
+        <w:t xml:space="preserve">N78-Dash - Privacy</w:t>
       </w:r>
       <w:r>
         <w:t xml:space="preserve"> </w:t>
@@ -539,23 +539,23 @@
         <w:t xml:space="preserve">pages/N78-Dash.privacy.html</w:t>
       </w:r>
       <w:r>
-        <w:t xml:space="preserve">) — https://nivo78.github.io/N78-Public-Legal/pages/N78-Dash.privacy.html</w:t>
-      </w:r>
-    </w:p>
-    <w:p>
-      <w:pPr>
-        <w:pStyle w:val="Compact"/>
-        <w:numPr>
-          <w:ilvl w:val="0"/>
-          <w:numId w:val="1002"/>
-        </w:numPr>
-      </w:pPr>
-      <w:r>
-        <w:rPr>
-          <w:b/>
-          <w:bCs/>
-        </w:rPr>
-        <w:t xml:space="preserve">N78-Dash — Terms</w:t>
+        <w:t xml:space="preserve">) - https://nivo78.github.io/N78-Public-Legal/pages/N78-Dash.privacy.html</w:t>
+      </w:r>
+    </w:p>
+    <w:p>
+      <w:pPr>
+        <w:pStyle w:val="Compact"/>
+        <w:numPr>
+          <w:ilvl w:val="0"/>
+          <w:numId w:val="1002"/>
+        </w:numPr>
+      </w:pPr>
+      <w:r>
+        <w:rPr>
+          <w:b/>
+          <w:bCs/>
+        </w:rPr>
+        <w:t xml:space="preserve">N78-Dash - Terms</w:t>
       </w:r>
       <w:r>
         <w:t xml:space="preserve"> </w:t>
@@ -570,23 +570,23 @@
         <w:t xml:space="preserve">pages/N78-Dash.terms.html</w:t>
       </w:r>
       <w:r>
-        <w:t xml:space="preserve">) — https://nivo78.github.io/N78-Public-Legal/pages/N78-Dash.terms.html</w:t>
-      </w:r>
-    </w:p>
-    <w:p>
-      <w:pPr>
-        <w:pStyle w:val="Compact"/>
-        <w:numPr>
-          <w:ilvl w:val="0"/>
-          <w:numId w:val="1002"/>
-        </w:numPr>
-      </w:pPr>
-      <w:r>
-        <w:rPr>
-          <w:b/>
-          <w:bCs/>
-        </w:rPr>
-        <w:t xml:space="preserve">N78-Electrical — Operator disclaimer</w:t>
+        <w:t xml:space="preserve">) - https://nivo78.github.io/N78-Public-Legal/pages/N78-Dash.terms.html</w:t>
+      </w:r>
+    </w:p>
+    <w:p>
+      <w:pPr>
+        <w:pStyle w:val="Compact"/>
+        <w:numPr>
+          <w:ilvl w:val="0"/>
+          <w:numId w:val="1002"/>
+        </w:numPr>
+      </w:pPr>
+      <w:r>
+        <w:rPr>
+          <w:b/>
+          <w:bCs/>
+        </w:rPr>
+        <w:t xml:space="preserve">N78-Electrical - Operator disclaimer</w:t>
       </w:r>
       <w:r>
         <w:t xml:space="preserve"> </w:t>
@@ -601,23 +601,23 @@
         <w:t xml:space="preserve">pages/N78-Electrical.operator.html</w:t>
       </w:r>
       <w:r>
-        <w:t xml:space="preserve">) — https://nivo78.github.io/N78-Public-Legal/pages/N78-Electrical.operator.html</w:t>
-      </w:r>
-    </w:p>
-    <w:p>
-      <w:pPr>
-        <w:pStyle w:val="Compact"/>
-        <w:numPr>
-          <w:ilvl w:val="0"/>
-          <w:numId w:val="1002"/>
-        </w:numPr>
-      </w:pPr>
-      <w:r>
-        <w:rPr>
-          <w:b/>
-          <w:bCs/>
-        </w:rPr>
-        <w:t xml:space="preserve">N78-Electrical — Privacy</w:t>
+        <w:t xml:space="preserve">) - https://nivo78.github.io/N78-Public-Legal/pages/N78-Electrical.operator.html</w:t>
+      </w:r>
+    </w:p>
+    <w:p>
+      <w:pPr>
+        <w:pStyle w:val="Compact"/>
+        <w:numPr>
+          <w:ilvl w:val="0"/>
+          <w:numId w:val="1002"/>
+        </w:numPr>
+      </w:pPr>
+      <w:r>
+        <w:rPr>
+          <w:b/>
+          <w:bCs/>
+        </w:rPr>
+        <w:t xml:space="preserve">N78-Electrical - Privacy</w:t>
       </w:r>
       <w:r>
         <w:t xml:space="preserve"> </w:t>
@@ -632,23 +632,23 @@
         <w:t xml:space="preserve">pages/N78-Electrical.privacy.html</w:t>
       </w:r>
       <w:r>
-        <w:t xml:space="preserve">) — https://nivo78.github.io/N78-Public-Legal/pages/N78-Electrical.privacy.html</w:t>
-      </w:r>
-    </w:p>
-    <w:p>
-      <w:pPr>
-        <w:pStyle w:val="Compact"/>
-        <w:numPr>
-          <w:ilvl w:val="0"/>
-          <w:numId w:val="1002"/>
-        </w:numPr>
-      </w:pPr>
-      <w:r>
-        <w:rPr>
-          <w:b/>
-          <w:bCs/>
-        </w:rPr>
-        <w:t xml:space="preserve">N78-Electrical — Terms</w:t>
+        <w:t xml:space="preserve">) - https://nivo78.github.io/N78-Public-Legal/pages/N78-Electrical.privacy.html</w:t>
+      </w:r>
+    </w:p>
+    <w:p>
+      <w:pPr>
+        <w:pStyle w:val="Compact"/>
+        <w:numPr>
+          <w:ilvl w:val="0"/>
+          <w:numId w:val="1002"/>
+        </w:numPr>
+      </w:pPr>
+      <w:r>
+        <w:rPr>
+          <w:b/>
+          <w:bCs/>
+        </w:rPr>
+        <w:t xml:space="preserve">N78-Electrical - Terms</w:t>
       </w:r>
       <w:r>
         <w:t xml:space="preserve"> </w:t>
@@ -663,23 +663,23 @@
         <w:t xml:space="preserve">pages/N78-Electrical.terms.html</w:t>
       </w:r>
       <w:r>
-        <w:t xml:space="preserve">) — https://nivo78.github.io/N78-Public-Legal/pages/N78-Electrical.terms.html</w:t>
-      </w:r>
-    </w:p>
-    <w:p>
-      <w:pPr>
-        <w:pStyle w:val="Compact"/>
-        <w:numPr>
-          <w:ilvl w:val="0"/>
-          <w:numId w:val="1002"/>
-        </w:numPr>
-      </w:pPr>
-      <w:r>
-        <w:rPr>
-          <w:b/>
-          <w:bCs/>
-        </w:rPr>
-        <w:t xml:space="preserve">N78-Estimate — Operator disclaimer</w:t>
+        <w:t xml:space="preserve">) - https://nivo78.github.io/N78-Public-Legal/pages/N78-Electrical.terms.html</w:t>
+      </w:r>
+    </w:p>
+    <w:p>
+      <w:pPr>
+        <w:pStyle w:val="Compact"/>
+        <w:numPr>
+          <w:ilvl w:val="0"/>
+          <w:numId w:val="1002"/>
+        </w:numPr>
+      </w:pPr>
+      <w:r>
+        <w:rPr>
+          <w:b/>
+          <w:bCs/>
+        </w:rPr>
+        <w:t xml:space="preserve">N78-Estimate - Operator disclaimer</w:t>
       </w:r>
       <w:r>
         <w:t xml:space="preserve"> </w:t>
@@ -694,23 +694,23 @@
         <w:t xml:space="preserve">pages/N78-Estimate.operator.html</w:t>
       </w:r>
       <w:r>
-        <w:t xml:space="preserve">) — https://nivo78.github.io/N78-Public-Legal/pages/N78-Estimate.operator.html</w:t>
-      </w:r>
-    </w:p>
-    <w:p>
-      <w:pPr>
-        <w:pStyle w:val="Compact"/>
-        <w:numPr>
-          <w:ilvl w:val="0"/>
-          <w:numId w:val="1002"/>
-        </w:numPr>
-      </w:pPr>
-      <w:r>
-        <w:rPr>
-          <w:b/>
-          <w:bCs/>
-        </w:rPr>
-        <w:t xml:space="preserve">N78-Estimate — Privacy</w:t>
+        <w:t xml:space="preserve">) - https://nivo78.github.io/N78-Public-Legal/pages/N78-Estimate.operator.html</w:t>
+      </w:r>
+    </w:p>
+    <w:p>
+      <w:pPr>
+        <w:pStyle w:val="Compact"/>
+        <w:numPr>
+          <w:ilvl w:val="0"/>
+          <w:numId w:val="1002"/>
+        </w:numPr>
+      </w:pPr>
+      <w:r>
+        <w:rPr>
+          <w:b/>
+          <w:bCs/>
+        </w:rPr>
+        <w:t xml:space="preserve">N78-Estimate - Privacy</w:t>
       </w:r>
       <w:r>
         <w:t xml:space="preserve"> </w:t>
@@ -725,23 +725,23 @@
         <w:t xml:space="preserve">pages/N78-Estimate.privacy.html</w:t>
       </w:r>
       <w:r>
-        <w:t xml:space="preserve">) — https://nivo78.github.io/N78-Public-Legal/pages/N78-Estimate.privacy.html</w:t>
-      </w:r>
-    </w:p>
-    <w:p>
-      <w:pPr>
-        <w:pStyle w:val="Compact"/>
-        <w:numPr>
-          <w:ilvl w:val="0"/>
-          <w:numId w:val="1002"/>
-        </w:numPr>
-      </w:pPr>
-      <w:r>
-        <w:rPr>
-          <w:b/>
-          <w:bCs/>
-        </w:rPr>
-        <w:t xml:space="preserve">N78-Estimate — Terms</w:t>
+        <w:t xml:space="preserve">) - https://nivo78.github.io/N78-Public-Legal/pages/N78-Estimate.privacy.html</w:t>
+      </w:r>
+    </w:p>
+    <w:p>
+      <w:pPr>
+        <w:pStyle w:val="Compact"/>
+        <w:numPr>
+          <w:ilvl w:val="0"/>
+          <w:numId w:val="1002"/>
+        </w:numPr>
+      </w:pPr>
+      <w:r>
+        <w:rPr>
+          <w:b/>
+          <w:bCs/>
+        </w:rPr>
+        <w:t xml:space="preserve">N78-Estimate - Terms</w:t>
       </w:r>
       <w:r>
         <w:t xml:space="preserve"> </w:t>
@@ -756,23 +756,23 @@
         <w:t xml:space="preserve">pages/N78-Estimate.terms.html</w:t>
       </w:r>
       <w:r>
-        <w:t xml:space="preserve">) — https://nivo78.github.io/N78-Public-Legal/pages/N78-Estimate.terms.html</w:t>
-      </w:r>
-    </w:p>
-    <w:p>
-      <w:pPr>
-        <w:pStyle w:val="Compact"/>
-        <w:numPr>
-          <w:ilvl w:val="0"/>
-          <w:numId w:val="1002"/>
-        </w:numPr>
-      </w:pPr>
-      <w:r>
-        <w:rPr>
-          <w:b/>
-          <w:bCs/>
-        </w:rPr>
-        <w:t xml:space="preserve">N78-FeatureLibrary — Operator disclaimer</w:t>
+        <w:t xml:space="preserve">) - https://nivo78.github.io/N78-Public-Legal/pages/N78-Estimate.terms.html</w:t>
+      </w:r>
+    </w:p>
+    <w:p>
+      <w:pPr>
+        <w:pStyle w:val="Compact"/>
+        <w:numPr>
+          <w:ilvl w:val="0"/>
+          <w:numId w:val="1002"/>
+        </w:numPr>
+      </w:pPr>
+      <w:r>
+        <w:rPr>
+          <w:b/>
+          <w:bCs/>
+        </w:rPr>
+        <w:t xml:space="preserve">N78-FeatureLibrary - Operator disclaimer</w:t>
       </w:r>
       <w:r>
         <w:t xml:space="preserve"> </w:t>
@@ -787,23 +787,23 @@
         <w:t xml:space="preserve">pages/N78-FeatureLibrary.operator.html</w:t>
       </w:r>
       <w:r>
-        <w:t xml:space="preserve">) — https://nivo78.github.io/N78-Public-Legal/pages/N78-FeatureLibrary.operator.html</w:t>
-      </w:r>
-    </w:p>
-    <w:p>
-      <w:pPr>
-        <w:pStyle w:val="Compact"/>
-        <w:numPr>
-          <w:ilvl w:val="0"/>
-          <w:numId w:val="1002"/>
-        </w:numPr>
-      </w:pPr>
-      <w:r>
-        <w:rPr>
-          <w:b/>
-          <w:bCs/>
-        </w:rPr>
-        <w:t xml:space="preserve">N78-FeatureLibrary — Privacy</w:t>
+        <w:t xml:space="preserve">) - https://nivo78.github.io/N78-Public-Legal/pages/N78-FeatureLibrary.operator.html</w:t>
+      </w:r>
+    </w:p>
+    <w:p>
+      <w:pPr>
+        <w:pStyle w:val="Compact"/>
+        <w:numPr>
+          <w:ilvl w:val="0"/>
+          <w:numId w:val="1002"/>
+        </w:numPr>
+      </w:pPr>
+      <w:r>
+        <w:rPr>
+          <w:b/>
+          <w:bCs/>
+        </w:rPr>
+        <w:t xml:space="preserve">N78-FeatureLibrary - Privacy</w:t>
       </w:r>
       <w:r>
         <w:t xml:space="preserve"> </w:t>
@@ -818,23 +818,23 @@
         <w:t xml:space="preserve">pages/N78-FeatureLibrary.privacy.html</w:t>
       </w:r>
       <w:r>
-        <w:t xml:space="preserve">) — https://nivo78.github.io/N78-Public-Legal/pages/N78-FeatureLibrary.privacy.html</w:t>
-      </w:r>
-    </w:p>
-    <w:p>
-      <w:pPr>
-        <w:pStyle w:val="Compact"/>
-        <w:numPr>
-          <w:ilvl w:val="0"/>
-          <w:numId w:val="1002"/>
-        </w:numPr>
-      </w:pPr>
-      <w:r>
-        <w:rPr>
-          <w:b/>
-          <w:bCs/>
-        </w:rPr>
-        <w:t xml:space="preserve">N78-FeatureLibrary — Terms</w:t>
+        <w:t xml:space="preserve">) - https://nivo78.github.io/N78-Public-Legal/pages/N78-FeatureLibrary.privacy.html</w:t>
+      </w:r>
+    </w:p>
+    <w:p>
+      <w:pPr>
+        <w:pStyle w:val="Compact"/>
+        <w:numPr>
+          <w:ilvl w:val="0"/>
+          <w:numId w:val="1002"/>
+        </w:numPr>
+      </w:pPr>
+      <w:r>
+        <w:rPr>
+          <w:b/>
+          <w:bCs/>
+        </w:rPr>
+        <w:t xml:space="preserve">N78-FeatureLibrary - Terms</w:t>
       </w:r>
       <w:r>
         <w:t xml:space="preserve"> </w:t>
@@ -849,23 +849,23 @@
         <w:t xml:space="preserve">pages/N78-FeatureLibrary.terms.html</w:t>
       </w:r>
       <w:r>
-        <w:t xml:space="preserve">) — https://nivo78.github.io/N78-Public-Legal/pages/N78-FeatureLibrary.terms.html</w:t>
-      </w:r>
-    </w:p>
-    <w:p>
-      <w:pPr>
-        <w:pStyle w:val="Compact"/>
-        <w:numPr>
-          <w:ilvl w:val="0"/>
-          <w:numId w:val="1002"/>
-        </w:numPr>
-      </w:pPr>
-      <w:r>
-        <w:rPr>
-          <w:b/>
-          <w:bCs/>
-        </w:rPr>
-        <w:t xml:space="preserve">N78-Frame — Operator disclaimer</w:t>
+        <w:t xml:space="preserve">) - https://nivo78.github.io/N78-Public-Legal/pages/N78-FeatureLibrary.terms.html</w:t>
+      </w:r>
+    </w:p>
+    <w:p>
+      <w:pPr>
+        <w:pStyle w:val="Compact"/>
+        <w:numPr>
+          <w:ilvl w:val="0"/>
+          <w:numId w:val="1002"/>
+        </w:numPr>
+      </w:pPr>
+      <w:r>
+        <w:rPr>
+          <w:b/>
+          <w:bCs/>
+        </w:rPr>
+        <w:t xml:space="preserve">N78-Frame - Operator disclaimer</w:t>
       </w:r>
       <w:r>
         <w:t xml:space="preserve"> </w:t>
@@ -880,23 +880,23 @@
         <w:t xml:space="preserve">pages/N78-Frame.operator.html</w:t>
       </w:r>
       <w:r>
-        <w:t xml:space="preserve">) — https://nivo78.github.io/N78-Public-Legal/pages/N78-Frame.operator.html</w:t>
-      </w:r>
-    </w:p>
-    <w:p>
-      <w:pPr>
-        <w:pStyle w:val="Compact"/>
-        <w:numPr>
-          <w:ilvl w:val="0"/>
-          <w:numId w:val="1002"/>
-        </w:numPr>
-      </w:pPr>
-      <w:r>
-        <w:rPr>
-          <w:b/>
-          <w:bCs/>
-        </w:rPr>
-        <w:t xml:space="preserve">N78-Frame — Privacy</w:t>
+        <w:t xml:space="preserve">) - https://nivo78.github.io/N78-Public-Legal/pages/N78-Frame.operator.html</w:t>
+      </w:r>
+    </w:p>
+    <w:p>
+      <w:pPr>
+        <w:pStyle w:val="Compact"/>
+        <w:numPr>
+          <w:ilvl w:val="0"/>
+          <w:numId w:val="1002"/>
+        </w:numPr>
+      </w:pPr>
+      <w:r>
+        <w:rPr>
+          <w:b/>
+          <w:bCs/>
+        </w:rPr>
+        <w:t xml:space="preserve">N78-Frame - Privacy</w:t>
       </w:r>
       <w:r>
         <w:t xml:space="preserve"> </w:t>
@@ -911,23 +911,23 @@
         <w:t xml:space="preserve">pages/N78-Frame.privacy.html</w:t>
       </w:r>
       <w:r>
-        <w:t xml:space="preserve">) — https://nivo78.github.io/N78-Public-Legal/pages/N78-Frame.privacy.html</w:t>
-      </w:r>
-    </w:p>
-    <w:p>
-      <w:pPr>
-        <w:pStyle w:val="Compact"/>
-        <w:numPr>
-          <w:ilvl w:val="0"/>
-          <w:numId w:val="1002"/>
-        </w:numPr>
-      </w:pPr>
-      <w:r>
-        <w:rPr>
-          <w:b/>
-          <w:bCs/>
-        </w:rPr>
-        <w:t xml:space="preserve">N78-Frame — Terms</w:t>
+        <w:t xml:space="preserve">) - https://nivo78.github.io/N78-Public-Legal/pages/N78-Frame.privacy.html</w:t>
+      </w:r>
+    </w:p>
+    <w:p>
+      <w:pPr>
+        <w:pStyle w:val="Compact"/>
+        <w:numPr>
+          <w:ilvl w:val="0"/>
+          <w:numId w:val="1002"/>
+        </w:numPr>
+      </w:pPr>
+      <w:r>
+        <w:rPr>
+          <w:b/>
+          <w:bCs/>
+        </w:rPr>
+        <w:t xml:space="preserve">N78-Frame - Terms</w:t>
       </w:r>
       <w:r>
         <w:t xml:space="preserve"> </w:t>
@@ -942,23 +942,23 @@
         <w:t xml:space="preserve">pages/N78-Frame.terms.html</w:t>
       </w:r>
       <w:r>
-        <w:t xml:space="preserve">) — https://nivo78.github.io/N78-Public-Legal/pages/N78-Frame.terms.html</w:t>
-      </w:r>
-    </w:p>
-    <w:p>
-      <w:pPr>
-        <w:pStyle w:val="Compact"/>
-        <w:numPr>
-          <w:ilvl w:val="0"/>
-          <w:numId w:val="1002"/>
-        </w:numPr>
-      </w:pPr>
-      <w:r>
-        <w:rPr>
-          <w:b/>
-          <w:bCs/>
-        </w:rPr>
-        <w:t xml:space="preserve">N78-Life — Operator disclaimer</w:t>
+        <w:t xml:space="preserve">) - https://nivo78.github.io/N78-Public-Legal/pages/N78-Frame.terms.html</w:t>
+      </w:r>
+    </w:p>
+    <w:p>
+      <w:pPr>
+        <w:pStyle w:val="Compact"/>
+        <w:numPr>
+          <w:ilvl w:val="0"/>
+          <w:numId w:val="1002"/>
+        </w:numPr>
+      </w:pPr>
+      <w:r>
+        <w:rPr>
+          <w:b/>
+          <w:bCs/>
+        </w:rPr>
+        <w:t xml:space="preserve">N78-Life - Operator disclaimer</w:t>
       </w:r>
       <w:r>
         <w:t xml:space="preserve"> </w:t>
@@ -973,23 +973,23 @@
         <w:t xml:space="preserve">pages/N78-Life.operator.html</w:t>
       </w:r>
       <w:r>
-        <w:t xml:space="preserve">) — https://nivo78.github.io/N78-Public-Legal/pages/N78-Life.operator.html</w:t>
-      </w:r>
-    </w:p>
-    <w:p>
-      <w:pPr>
-        <w:pStyle w:val="Compact"/>
-        <w:numPr>
-          <w:ilvl w:val="0"/>
-          <w:numId w:val="1002"/>
-        </w:numPr>
-      </w:pPr>
-      <w:r>
-        <w:rPr>
-          <w:b/>
-          <w:bCs/>
-        </w:rPr>
-        <w:t xml:space="preserve">N78-Life — Privacy</w:t>
+        <w:t xml:space="preserve">) - https://nivo78.github.io/N78-Public-Legal/pages/N78-Life.operator.html</w:t>
+      </w:r>
+    </w:p>
+    <w:p>
+      <w:pPr>
+        <w:pStyle w:val="Compact"/>
+        <w:numPr>
+          <w:ilvl w:val="0"/>
+          <w:numId w:val="1002"/>
+        </w:numPr>
+      </w:pPr>
+      <w:r>
+        <w:rPr>
+          <w:b/>
+          <w:bCs/>
+        </w:rPr>
+        <w:t xml:space="preserve">N78-Life - Privacy</w:t>
       </w:r>
       <w:r>
         <w:t xml:space="preserve"> </w:t>
@@ -1004,23 +1004,23 @@
         <w:t xml:space="preserve">pages/N78-Life.privacy.html</w:t>
       </w:r>
       <w:r>
-        <w:t xml:space="preserve">) — https://nivo78.github.io/N78-Public-Legal/pages/N78-Life.privacy.html</w:t>
-      </w:r>
-    </w:p>
-    <w:p>
-      <w:pPr>
-        <w:pStyle w:val="Compact"/>
-        <w:numPr>
-          <w:ilvl w:val="0"/>
-          <w:numId w:val="1002"/>
-        </w:numPr>
-      </w:pPr>
-      <w:r>
-        <w:rPr>
-          <w:b/>
-          <w:bCs/>
-        </w:rPr>
-        <w:t xml:space="preserve">N78-Life — Terms</w:t>
+        <w:t xml:space="preserve">) - https://nivo78.github.io/N78-Public-Legal/pages/N78-Life.privacy.html</w:t>
+      </w:r>
+    </w:p>
+    <w:p>
+      <w:pPr>
+        <w:pStyle w:val="Compact"/>
+        <w:numPr>
+          <w:ilvl w:val="0"/>
+          <w:numId w:val="1002"/>
+        </w:numPr>
+      </w:pPr>
+      <w:r>
+        <w:rPr>
+          <w:b/>
+          <w:bCs/>
+        </w:rPr>
+        <w:t xml:space="preserve">N78-Life - Terms</w:t>
       </w:r>
       <w:r>
         <w:t xml:space="preserve"> </w:t>
@@ -1035,23 +1035,23 @@
         <w:t xml:space="preserve">pages/N78-Life.terms.html</w:t>
       </w:r>
       <w:r>
-        <w:t xml:space="preserve">) — https://nivo78.github.io/N78-Public-Legal/pages/N78-Life.terms.html</w:t>
-      </w:r>
-    </w:p>
-    <w:p>
-      <w:pPr>
-        <w:pStyle w:val="Compact"/>
-        <w:numPr>
-          <w:ilvl w:val="0"/>
-          <w:numId w:val="1002"/>
-        </w:numPr>
-      </w:pPr>
-      <w:r>
-        <w:rPr>
-          <w:b/>
-          <w:bCs/>
-        </w:rPr>
-        <w:t xml:space="preserve">N78-Machining — Operator disclaimer</w:t>
+        <w:t xml:space="preserve">) - https://nivo78.github.io/N78-Public-Legal/pages/N78-Life.terms.html</w:t>
+      </w:r>
+    </w:p>
+    <w:p>
+      <w:pPr>
+        <w:pStyle w:val="Compact"/>
+        <w:numPr>
+          <w:ilvl w:val="0"/>
+          <w:numId w:val="1002"/>
+        </w:numPr>
+      </w:pPr>
+      <w:r>
+        <w:rPr>
+          <w:b/>
+          <w:bCs/>
+        </w:rPr>
+        <w:t xml:space="preserve">N78-Machining - Operator disclaimer</w:t>
       </w:r>
       <w:r>
         <w:t xml:space="preserve"> </w:t>
@@ -1066,23 +1066,23 @@
         <w:t xml:space="preserve">pages/N78-Machining.operator.html</w:t>
       </w:r>
       <w:r>
-        <w:t xml:space="preserve">) — https://nivo78.github.io/N78-Public-Legal/pages/N78-Machining.operator.html</w:t>
-      </w:r>
-    </w:p>
-    <w:p>
-      <w:pPr>
-        <w:pStyle w:val="Compact"/>
-        <w:numPr>
-          <w:ilvl w:val="0"/>
-          <w:numId w:val="1002"/>
-        </w:numPr>
-      </w:pPr>
-      <w:r>
-        <w:rPr>
-          <w:b/>
-          <w:bCs/>
-        </w:rPr>
-        <w:t xml:space="preserve">N78-Machining — Privacy</w:t>
+        <w:t xml:space="preserve">) - https://nivo78.github.io/N78-Public-Legal/pages/N78-Machining.operator.html</w:t>
+      </w:r>
+    </w:p>
+    <w:p>
+      <w:pPr>
+        <w:pStyle w:val="Compact"/>
+        <w:numPr>
+          <w:ilvl w:val="0"/>
+          <w:numId w:val="1002"/>
+        </w:numPr>
+      </w:pPr>
+      <w:r>
+        <w:rPr>
+          <w:b/>
+          <w:bCs/>
+        </w:rPr>
+        <w:t xml:space="preserve">N78-Machining - Privacy</w:t>
       </w:r>
       <w:r>
         <w:t xml:space="preserve"> </w:t>
@@ -1097,23 +1097,23 @@
         <w:t xml:space="preserve">pages/N78-Machining.privacy.html</w:t>
       </w:r>
       <w:r>
-        <w:t xml:space="preserve">) — https://nivo78.github.io/N78-Public-Legal/pages/N78-Machining.privacy.html</w:t>
-      </w:r>
-    </w:p>
-    <w:p>
-      <w:pPr>
-        <w:pStyle w:val="Compact"/>
-        <w:numPr>
-          <w:ilvl w:val="0"/>
-          <w:numId w:val="1002"/>
-        </w:numPr>
-      </w:pPr>
-      <w:r>
-        <w:rPr>
-          <w:b/>
-          <w:bCs/>
-        </w:rPr>
-        <w:t xml:space="preserve">N78-Machining — Terms</w:t>
+        <w:t xml:space="preserve">) - https://nivo78.github.io/N78-Public-Legal/pages/N78-Machining.privacy.html</w:t>
+      </w:r>
+    </w:p>
+    <w:p>
+      <w:pPr>
+        <w:pStyle w:val="Compact"/>
+        <w:numPr>
+          <w:ilvl w:val="0"/>
+          <w:numId w:val="1002"/>
+        </w:numPr>
+      </w:pPr>
+      <w:r>
+        <w:rPr>
+          <w:b/>
+          <w:bCs/>
+        </w:rPr>
+        <w:t xml:space="preserve">N78-Machining - Terms</w:t>
       </w:r>
       <w:r>
         <w:t xml:space="preserve"> </w:t>
@@ -1128,23 +1128,23 @@
         <w:t xml:space="preserve">pages/N78-Machining.terms.html</w:t>
       </w:r>
       <w:r>
-        <w:t xml:space="preserve">) — https://nivo78.github.io/N78-Public-Legal/pages/N78-Machining.terms.html</w:t>
-      </w:r>
-    </w:p>
-    <w:p>
-      <w:pPr>
-        <w:pStyle w:val="Compact"/>
-        <w:numPr>
-          <w:ilvl w:val="0"/>
-          <w:numId w:val="1002"/>
-        </w:numPr>
-      </w:pPr>
-      <w:r>
-        <w:rPr>
-          <w:b/>
-          <w:bCs/>
-        </w:rPr>
-        <w:t xml:space="preserve">N78-Ops — Operator disclaimer</w:t>
+        <w:t xml:space="preserve">) - https://nivo78.github.io/N78-Public-Legal/pages/N78-Machining.terms.html</w:t>
+      </w:r>
+    </w:p>
+    <w:p>
+      <w:pPr>
+        <w:pStyle w:val="Compact"/>
+        <w:numPr>
+          <w:ilvl w:val="0"/>
+          <w:numId w:val="1002"/>
+        </w:numPr>
+      </w:pPr>
+      <w:r>
+        <w:rPr>
+          <w:b/>
+          <w:bCs/>
+        </w:rPr>
+        <w:t xml:space="preserve">N78-Ops - Operator disclaimer</w:t>
       </w:r>
       <w:r>
         <w:t xml:space="preserve"> </w:t>
@@ -1159,23 +1159,23 @@
         <w:t xml:space="preserve">pages/N78-Ops.operator.html</w:t>
       </w:r>
       <w:r>
-        <w:t xml:space="preserve">) — https://nivo78.github.io/N78-Public-Legal/pages/N78-Ops.operator.html</w:t>
-      </w:r>
-    </w:p>
-    <w:p>
-      <w:pPr>
-        <w:pStyle w:val="Compact"/>
-        <w:numPr>
-          <w:ilvl w:val="0"/>
-          <w:numId w:val="1002"/>
-        </w:numPr>
-      </w:pPr>
-      <w:r>
-        <w:rPr>
-          <w:b/>
-          <w:bCs/>
-        </w:rPr>
-        <w:t xml:space="preserve">N78-Ops — Privacy</w:t>
+        <w:t xml:space="preserve">) - https://nivo78.github.io/N78-Public-Legal/pages/N78-Ops.operator.html</w:t>
+      </w:r>
+    </w:p>
+    <w:p>
+      <w:pPr>
+        <w:pStyle w:val="Compact"/>
+        <w:numPr>
+          <w:ilvl w:val="0"/>
+          <w:numId w:val="1002"/>
+        </w:numPr>
+      </w:pPr>
+      <w:r>
+        <w:rPr>
+          <w:b/>
+          <w:bCs/>
+        </w:rPr>
+        <w:t xml:space="preserve">N78-Ops - Privacy</w:t>
       </w:r>
       <w:r>
         <w:t xml:space="preserve"> </w:t>
@@ -1190,23 +1190,23 @@
         <w:t xml:space="preserve">pages/N78-Ops.privacy.html</w:t>
       </w:r>
       <w:r>
-        <w:t xml:space="preserve">) — https://nivo78.github.io/N78-Public-Legal/pages/N78-Ops.privacy.html</w:t>
-      </w:r>
-    </w:p>
-    <w:p>
-      <w:pPr>
-        <w:pStyle w:val="Compact"/>
-        <w:numPr>
-          <w:ilvl w:val="0"/>
-          <w:numId w:val="1002"/>
-        </w:numPr>
-      </w:pPr>
-      <w:r>
-        <w:rPr>
-          <w:b/>
-          <w:bCs/>
-        </w:rPr>
-        <w:t xml:space="preserve">N78-Ops — Terms</w:t>
+        <w:t xml:space="preserve">) - https://nivo78.github.io/N78-Public-Legal/pages/N78-Ops.privacy.html</w:t>
+      </w:r>
+    </w:p>
+    <w:p>
+      <w:pPr>
+        <w:pStyle w:val="Compact"/>
+        <w:numPr>
+          <w:ilvl w:val="0"/>
+          <w:numId w:val="1002"/>
+        </w:numPr>
+      </w:pPr>
+      <w:r>
+        <w:rPr>
+          <w:b/>
+          <w:bCs/>
+        </w:rPr>
+        <w:t xml:space="preserve">N78-Ops - Terms</w:t>
       </w:r>
       <w:r>
         <w:t xml:space="preserve"> </w:t>
@@ -1221,23 +1221,23 @@
         <w:t xml:space="preserve">pages/N78-Ops.terms.html</w:t>
       </w:r>
       <w:r>
-        <w:t xml:space="preserve">) — https://nivo78.github.io/N78-Public-Legal/pages/N78-Ops.terms.html</w:t>
-      </w:r>
-    </w:p>
-    <w:p>
-      <w:pPr>
-        <w:pStyle w:val="Compact"/>
-        <w:numPr>
-          <w:ilvl w:val="0"/>
-          <w:numId w:val="1002"/>
-        </w:numPr>
-      </w:pPr>
-      <w:r>
-        <w:rPr>
-          <w:b/>
-          <w:bCs/>
-        </w:rPr>
-        <w:t xml:space="preserve">N78-Probe — Operator disclaimer</w:t>
+        <w:t xml:space="preserve">) - https://nivo78.github.io/N78-Public-Legal/pages/N78-Ops.terms.html</w:t>
+      </w:r>
+    </w:p>
+    <w:p>
+      <w:pPr>
+        <w:pStyle w:val="Compact"/>
+        <w:numPr>
+          <w:ilvl w:val="0"/>
+          <w:numId w:val="1002"/>
+        </w:numPr>
+      </w:pPr>
+      <w:r>
+        <w:rPr>
+          <w:b/>
+          <w:bCs/>
+        </w:rPr>
+        <w:t xml:space="preserve">N78-Probe - Operator disclaimer</w:t>
       </w:r>
       <w:r>
         <w:t xml:space="preserve"> </w:t>
@@ -1252,23 +1252,23 @@
         <w:t xml:space="preserve">pages/N78-Probe.operator.html</w:t>
       </w:r>
       <w:r>
-        <w:t xml:space="preserve">) — https://nivo78.github.io/N78-Public-Legal/pages/N78-Probe.operator.html</w:t>
-      </w:r>
-    </w:p>
-    <w:p>
-      <w:pPr>
-        <w:pStyle w:val="Compact"/>
-        <w:numPr>
-          <w:ilvl w:val="0"/>
-          <w:numId w:val="1002"/>
-        </w:numPr>
-      </w:pPr>
-      <w:r>
-        <w:rPr>
-          <w:b/>
-          <w:bCs/>
-        </w:rPr>
-        <w:t xml:space="preserve">N78-Probe — Privacy</w:t>
+        <w:t xml:space="preserve">) - https://nivo78.github.io/N78-Public-Legal/pages/N78-Probe.operator.html</w:t>
+      </w:r>
+    </w:p>
+    <w:p>
+      <w:pPr>
+        <w:pStyle w:val="Compact"/>
+        <w:numPr>
+          <w:ilvl w:val="0"/>
+          <w:numId w:val="1002"/>
+        </w:numPr>
+      </w:pPr>
+      <w:r>
+        <w:rPr>
+          <w:b/>
+          <w:bCs/>
+        </w:rPr>
+        <w:t xml:space="preserve">N78-Probe - Privacy</w:t>
       </w:r>
       <w:r>
         <w:t xml:space="preserve"> </w:t>
@@ -1283,23 +1283,23 @@
         <w:t xml:space="preserve">pages/N78-Probe.privacy.html</w:t>
       </w:r>
       <w:r>
-        <w:t xml:space="preserve">) — https://nivo78.github.io/N78-Public-Legal/pages/N78-Probe.privacy.html</w:t>
-      </w:r>
-    </w:p>
-    <w:p>
-      <w:pPr>
-        <w:pStyle w:val="Compact"/>
-        <w:numPr>
-          <w:ilvl w:val="0"/>
-          <w:numId w:val="1002"/>
-        </w:numPr>
-      </w:pPr>
-      <w:r>
-        <w:rPr>
-          <w:b/>
-          <w:bCs/>
-        </w:rPr>
-        <w:t xml:space="preserve">N78-Probe — Terms</w:t>
+        <w:t xml:space="preserve">) - https://nivo78.github.io/N78-Public-Legal/pages/N78-Probe.privacy.html</w:t>
+      </w:r>
+    </w:p>
+    <w:p>
+      <w:pPr>
+        <w:pStyle w:val="Compact"/>
+        <w:numPr>
+          <w:ilvl w:val="0"/>
+          <w:numId w:val="1002"/>
+        </w:numPr>
+      </w:pPr>
+      <w:r>
+        <w:rPr>
+          <w:b/>
+          <w:bCs/>
+        </w:rPr>
+        <w:t xml:space="preserve">N78-Probe - Terms</w:t>
       </w:r>
       <w:r>
         <w:t xml:space="preserve"> </w:t>
@@ -1314,23 +1314,23 @@
         <w:t xml:space="preserve">pages/N78-Probe.terms.html</w:t>
       </w:r>
       <w:r>
-        <w:t xml:space="preserve">) — https://nivo78.github.io/N78-Public-Legal/pages/N78-Probe.terms.html</w:t>
-      </w:r>
-    </w:p>
-    <w:p>
-      <w:pPr>
-        <w:pStyle w:val="Compact"/>
-        <w:numPr>
-          <w:ilvl w:val="0"/>
-          <w:numId w:val="1002"/>
-        </w:numPr>
-      </w:pPr>
-      <w:r>
-        <w:rPr>
-          <w:b/>
-          <w:bCs/>
-        </w:rPr>
-        <w:t xml:space="preserve">N78-QRTest — Operator disclaimer</w:t>
+        <w:t xml:space="preserve">) - https://nivo78.github.io/N78-Public-Legal/pages/N78-Probe.terms.html</w:t>
+      </w:r>
+    </w:p>
+    <w:p>
+      <w:pPr>
+        <w:pStyle w:val="Compact"/>
+        <w:numPr>
+          <w:ilvl w:val="0"/>
+          <w:numId w:val="1002"/>
+        </w:numPr>
+      </w:pPr>
+      <w:r>
+        <w:rPr>
+          <w:b/>
+          <w:bCs/>
+        </w:rPr>
+        <w:t xml:space="preserve">N78-QRTest - Operator disclaimer</w:t>
       </w:r>
       <w:r>
         <w:t xml:space="preserve"> </w:t>
@@ -1345,23 +1345,23 @@
         <w:t xml:space="preserve">pages/N78-QRTest.operator.html</w:t>
       </w:r>
       <w:r>
-        <w:t xml:space="preserve">) — https://nivo78.github.io/N78-Public-Legal/pages/N78-QRTest.operator.html</w:t>
-      </w:r>
-    </w:p>
-    <w:p>
-      <w:pPr>
-        <w:pStyle w:val="Compact"/>
-        <w:numPr>
-          <w:ilvl w:val="0"/>
-          <w:numId w:val="1002"/>
-        </w:numPr>
-      </w:pPr>
-      <w:r>
-        <w:rPr>
-          <w:b/>
-          <w:bCs/>
-        </w:rPr>
-        <w:t xml:space="preserve">N78-QRTest — Privacy</w:t>
+        <w:t xml:space="preserve">) - https://nivo78.github.io/N78-Public-Legal/pages/N78-QRTest.operator.html</w:t>
+      </w:r>
+    </w:p>
+    <w:p>
+      <w:pPr>
+        <w:pStyle w:val="Compact"/>
+        <w:numPr>
+          <w:ilvl w:val="0"/>
+          <w:numId w:val="1002"/>
+        </w:numPr>
+      </w:pPr>
+      <w:r>
+        <w:rPr>
+          <w:b/>
+          <w:bCs/>
+        </w:rPr>
+        <w:t xml:space="preserve">N78-QRTest - Privacy</w:t>
       </w:r>
       <w:r>
         <w:t xml:space="preserve"> </w:t>
@@ -1376,23 +1376,23 @@
         <w:t xml:space="preserve">pages/N78-QRTest.privacy.html</w:t>
       </w:r>
       <w:r>
-        <w:t xml:space="preserve">) — https://nivo78.github.io/N78-Public-Legal/pages/N78-QRTest.privacy.html</w:t>
-      </w:r>
-    </w:p>
-    <w:p>
-      <w:pPr>
-        <w:pStyle w:val="Compact"/>
-        <w:numPr>
-          <w:ilvl w:val="0"/>
-          <w:numId w:val="1002"/>
-        </w:numPr>
-      </w:pPr>
-      <w:r>
-        <w:rPr>
-          <w:b/>
-          <w:bCs/>
-        </w:rPr>
-        <w:t xml:space="preserve">N78-QRTest — Terms</w:t>
+        <w:t xml:space="preserve">) - https://nivo78.github.io/N78-Public-Legal/pages/N78-QRTest.privacy.html</w:t>
+      </w:r>
+    </w:p>
+    <w:p>
+      <w:pPr>
+        <w:pStyle w:val="Compact"/>
+        <w:numPr>
+          <w:ilvl w:val="0"/>
+          <w:numId w:val="1002"/>
+        </w:numPr>
+      </w:pPr>
+      <w:r>
+        <w:rPr>
+          <w:b/>
+          <w:bCs/>
+        </w:rPr>
+        <w:t xml:space="preserve">N78-QRTest - Terms</w:t>
       </w:r>
       <w:r>
         <w:t xml:space="preserve"> </w:t>
@@ -1407,23 +1407,23 @@
         <w:t xml:space="preserve">pages/N78-QRTest.terms.html</w:t>
       </w:r>
       <w:r>
-        <w:t xml:space="preserve">) — https://nivo78.github.io/N78-Public-Legal/pages/N78-QRTest.terms.html</w:t>
-      </w:r>
-    </w:p>
-    <w:p>
-      <w:pPr>
-        <w:pStyle w:val="Compact"/>
-        <w:numPr>
-          <w:ilvl w:val="0"/>
-          <w:numId w:val="1002"/>
-        </w:numPr>
-      </w:pPr>
-      <w:r>
-        <w:rPr>
-          <w:b/>
-          <w:bCs/>
-        </w:rPr>
-        <w:t xml:space="preserve">N78-Standards — Operator disclaimer</w:t>
+        <w:t xml:space="preserve">) - https://nivo78.github.io/N78-Public-Legal/pages/N78-QRTest.terms.html</w:t>
+      </w:r>
+    </w:p>
+    <w:p>
+      <w:pPr>
+        <w:pStyle w:val="Compact"/>
+        <w:numPr>
+          <w:ilvl w:val="0"/>
+          <w:numId w:val="1002"/>
+        </w:numPr>
+      </w:pPr>
+      <w:r>
+        <w:rPr>
+          <w:b/>
+          <w:bCs/>
+        </w:rPr>
+        <w:t xml:space="preserve">N78-Standards - Operator disclaimer</w:t>
       </w:r>
       <w:r>
         <w:t xml:space="preserve"> </w:t>
@@ -1438,23 +1438,23 @@
         <w:t xml:space="preserve">pages/N78-Standards.operator.html</w:t>
       </w:r>
       <w:r>
-        <w:t xml:space="preserve">) — https://nivo78.github.io/N78-Public-Legal/pages/N78-Standards.operator.html</w:t>
-      </w:r>
-    </w:p>
-    <w:p>
-      <w:pPr>
-        <w:pStyle w:val="Compact"/>
-        <w:numPr>
-          <w:ilvl w:val="0"/>
-          <w:numId w:val="1002"/>
-        </w:numPr>
-      </w:pPr>
-      <w:r>
-        <w:rPr>
-          <w:b/>
-          <w:bCs/>
-        </w:rPr>
-        <w:t xml:space="preserve">N78-Standards — Privacy</w:t>
+        <w:t xml:space="preserve">) - https://nivo78.github.io/N78-Public-Legal/pages/N78-Standards.operator.html</w:t>
+      </w:r>
+    </w:p>
+    <w:p>
+      <w:pPr>
+        <w:pStyle w:val="Compact"/>
+        <w:numPr>
+          <w:ilvl w:val="0"/>
+          <w:numId w:val="1002"/>
+        </w:numPr>
+      </w:pPr>
+      <w:r>
+        <w:rPr>
+          <w:b/>
+          <w:bCs/>
+        </w:rPr>
+        <w:t xml:space="preserve">N78-Standards - Privacy</w:t>
       </w:r>
       <w:r>
         <w:t xml:space="preserve"> </w:t>
@@ -1469,23 +1469,23 @@
         <w:t xml:space="preserve">pages/N78-Standards.privacy.html</w:t>
       </w:r>
       <w:r>
-        <w:t xml:space="preserve">) — https://nivo78.github.io/N78-Public-Legal/pages/N78-Standards.privacy.html</w:t>
-      </w:r>
-    </w:p>
-    <w:p>
-      <w:pPr>
-        <w:pStyle w:val="Compact"/>
-        <w:numPr>
-          <w:ilvl w:val="0"/>
-          <w:numId w:val="1002"/>
-        </w:numPr>
-      </w:pPr>
-      <w:r>
-        <w:rPr>
-          <w:b/>
-          <w:bCs/>
-        </w:rPr>
-        <w:t xml:space="preserve">N78-Standards — Terms</w:t>
+        <w:t xml:space="preserve">) - https://nivo78.github.io/N78-Public-Legal/pages/N78-Standards.privacy.html</w:t>
+      </w:r>
+    </w:p>
+    <w:p>
+      <w:pPr>
+        <w:pStyle w:val="Compact"/>
+        <w:numPr>
+          <w:ilvl w:val="0"/>
+          <w:numId w:val="1002"/>
+        </w:numPr>
+      </w:pPr>
+      <w:r>
+        <w:rPr>
+          <w:b/>
+          <w:bCs/>
+        </w:rPr>
+        <w:t xml:space="preserve">N78-Standards - Terms</w:t>
       </w:r>
       <w:r>
         <w:t xml:space="preserve"> </w:t>
@@ -1500,23 +1500,23 @@
         <w:t xml:space="preserve">pages/N78-Standards.terms.html</w:t>
       </w:r>
       <w:r>
-        <w:t xml:space="preserve">) — https://nivo78.github.io/N78-Public-Legal/pages/N78-Standards.terms.html</w:t>
-      </w:r>
-    </w:p>
-    <w:p>
-      <w:pPr>
-        <w:pStyle w:val="Compact"/>
-        <w:numPr>
-          <w:ilvl w:val="0"/>
-          <w:numId w:val="1002"/>
-        </w:numPr>
-      </w:pPr>
-      <w:r>
-        <w:rPr>
-          <w:b/>
-          <w:bCs/>
-        </w:rPr>
-        <w:t xml:space="preserve">N78-Template — Operator disclaimer</w:t>
+        <w:t xml:space="preserve">) - https://nivo78.github.io/N78-Public-Legal/pages/N78-Standards.terms.html</w:t>
+      </w:r>
+    </w:p>
+    <w:p>
+      <w:pPr>
+        <w:pStyle w:val="Compact"/>
+        <w:numPr>
+          <w:ilvl w:val="0"/>
+          <w:numId w:val="1002"/>
+        </w:numPr>
+      </w:pPr>
+      <w:r>
+        <w:rPr>
+          <w:b/>
+          <w:bCs/>
+        </w:rPr>
+        <w:t xml:space="preserve">N78-Template - Operator disclaimer</w:t>
       </w:r>
       <w:r>
         <w:t xml:space="preserve"> </w:t>
@@ -1531,23 +1531,23 @@
         <w:t xml:space="preserve">pages/N78-Template.operator.html</w:t>
       </w:r>
       <w:r>
-        <w:t xml:space="preserve">) — https://nivo78.github.io/N78-Public-Legal/pages/N78-Template.operator.html</w:t>
-      </w:r>
-    </w:p>
-    <w:p>
-      <w:pPr>
-        <w:pStyle w:val="Compact"/>
-        <w:numPr>
-          <w:ilvl w:val="0"/>
-          <w:numId w:val="1002"/>
-        </w:numPr>
-      </w:pPr>
-      <w:r>
-        <w:rPr>
-          <w:b/>
-          <w:bCs/>
-        </w:rPr>
-        <w:t xml:space="preserve">N78-Template — Privacy</w:t>
+        <w:t xml:space="preserve">) - https://nivo78.github.io/N78-Public-Legal/pages/N78-Template.operator.html</w:t>
+      </w:r>
+    </w:p>
+    <w:p>
+      <w:pPr>
+        <w:pStyle w:val="Compact"/>
+        <w:numPr>
+          <w:ilvl w:val="0"/>
+          <w:numId w:val="1002"/>
+        </w:numPr>
+      </w:pPr>
+      <w:r>
+        <w:rPr>
+          <w:b/>
+          <w:bCs/>
+        </w:rPr>
+        <w:t xml:space="preserve">N78-Template - Privacy</w:t>
       </w:r>
       <w:r>
         <w:t xml:space="preserve"> </w:t>
@@ -1562,23 +1562,23 @@
         <w:t xml:space="preserve">pages/N78-Template.privacy.html</w:t>
       </w:r>
       <w:r>
-        <w:t xml:space="preserve">) — https://nivo78.github.io/N78-Public-Legal/pages/N78-Template.privacy.html</w:t>
-      </w:r>
-    </w:p>
-    <w:p>
-      <w:pPr>
-        <w:pStyle w:val="Compact"/>
-        <w:numPr>
-          <w:ilvl w:val="0"/>
-          <w:numId w:val="1002"/>
-        </w:numPr>
-      </w:pPr>
-      <w:r>
-        <w:rPr>
-          <w:b/>
-          <w:bCs/>
-        </w:rPr>
-        <w:t xml:space="preserve">N78-Template — Terms</w:t>
+        <w:t xml:space="preserve">) - https://nivo78.github.io/N78-Public-Legal/pages/N78-Template.privacy.html</w:t>
+      </w:r>
+    </w:p>
+    <w:p>
+      <w:pPr>
+        <w:pStyle w:val="Compact"/>
+        <w:numPr>
+          <w:ilvl w:val="0"/>
+          <w:numId w:val="1002"/>
+        </w:numPr>
+      </w:pPr>
+      <w:r>
+        <w:rPr>
+          <w:b/>
+          <w:bCs/>
+        </w:rPr>
+        <w:t xml:space="preserve">N78-Template - Terms</w:t>
       </w:r>
       <w:r>
         <w:t xml:space="preserve"> </w:t>
@@ -1593,23 +1593,23 @@
         <w:t xml:space="preserve">pages/N78-Template.terms.html</w:t>
       </w:r>
       <w:r>
-        <w:t xml:space="preserve">) — https://nivo78.github.io/N78-Public-Legal/pages/N78-Template.terms.html</w:t>
-      </w:r>
-    </w:p>
-    <w:p>
-      <w:pPr>
-        <w:pStyle w:val="Compact"/>
-        <w:numPr>
-          <w:ilvl w:val="0"/>
-          <w:numId w:val="1002"/>
-        </w:numPr>
-      </w:pPr>
-      <w:r>
-        <w:rPr>
-          <w:b/>
-          <w:bCs/>
-        </w:rPr>
-        <w:t xml:space="preserve">N78-ThinStl — Operator disclaimer</w:t>
+        <w:t xml:space="preserve">) - https://nivo78.github.io/N78-Public-Legal/pages/N78-Template.terms.html</w:t>
+      </w:r>
+    </w:p>
+    <w:p>
+      <w:pPr>
+        <w:pStyle w:val="Compact"/>
+        <w:numPr>
+          <w:ilvl w:val="0"/>
+          <w:numId w:val="1002"/>
+        </w:numPr>
+      </w:pPr>
+      <w:r>
+        <w:rPr>
+          <w:b/>
+          <w:bCs/>
+        </w:rPr>
+        <w:t xml:space="preserve">N78-ThinStl - Operator disclaimer</w:t>
       </w:r>
       <w:r>
         <w:t xml:space="preserve"> </w:t>
@@ -1624,23 +1624,23 @@
         <w:t xml:space="preserve">pages/N78-ThinStl.operator.html</w:t>
       </w:r>
       <w:r>
-        <w:t xml:space="preserve">) — https://nivo78.github.io/N78-Public-Legal/pages/N78-ThinStl.operator.html</w:t>
-      </w:r>
-    </w:p>
-    <w:p>
-      <w:pPr>
-        <w:pStyle w:val="Compact"/>
-        <w:numPr>
-          <w:ilvl w:val="0"/>
-          <w:numId w:val="1002"/>
-        </w:numPr>
-      </w:pPr>
-      <w:r>
-        <w:rPr>
-          <w:b/>
-          <w:bCs/>
-        </w:rPr>
-        <w:t xml:space="preserve">N78-ThinStl — Privacy</w:t>
+        <w:t xml:space="preserve">) - https://nivo78.github.io/N78-Public-Legal/pages/N78-ThinStl.operator.html</w:t>
+      </w:r>
+    </w:p>
+    <w:p>
+      <w:pPr>
+        <w:pStyle w:val="Compact"/>
+        <w:numPr>
+          <w:ilvl w:val="0"/>
+          <w:numId w:val="1002"/>
+        </w:numPr>
+      </w:pPr>
+      <w:r>
+        <w:rPr>
+          <w:b/>
+          <w:bCs/>
+        </w:rPr>
+        <w:t xml:space="preserve">N78-ThinStl - Privacy</w:t>
       </w:r>
       <w:r>
         <w:t xml:space="preserve"> </w:t>
@@ -1655,23 +1655,23 @@
         <w:t xml:space="preserve">pages/N78-ThinStl.privacy.html</w:t>
       </w:r>
       <w:r>
-        <w:t xml:space="preserve">) — https://nivo78.github.io/N78-Public-Legal/pages/N78-ThinStl.privacy.html</w:t>
-      </w:r>
-    </w:p>
-    <w:p>
-      <w:pPr>
-        <w:pStyle w:val="Compact"/>
-        <w:numPr>
-          <w:ilvl w:val="0"/>
-          <w:numId w:val="1002"/>
-        </w:numPr>
-      </w:pPr>
-      <w:r>
-        <w:rPr>
-          <w:b/>
-          <w:bCs/>
-        </w:rPr>
-        <w:t xml:space="preserve">N78-ThinStl — Terms</w:t>
+        <w:t xml:space="preserve">) - https://nivo78.github.io/N78-Public-Legal/pages/N78-ThinStl.privacy.html</w:t>
+      </w:r>
+    </w:p>
+    <w:p>
+      <w:pPr>
+        <w:pStyle w:val="Compact"/>
+        <w:numPr>
+          <w:ilvl w:val="0"/>
+          <w:numId w:val="1002"/>
+        </w:numPr>
+      </w:pPr>
+      <w:r>
+        <w:rPr>
+          <w:b/>
+          <w:bCs/>
+        </w:rPr>
+        <w:t xml:space="preserve">N78-ThinStl - Terms</w:t>
       </w:r>
       <w:r>
         <w:t xml:space="preserve"> </w:t>
@@ -1686,23 +1686,23 @@
         <w:t xml:space="preserve">pages/N78-ThinStl.terms.html</w:t>
       </w:r>
       <w:r>
-        <w:t xml:space="preserve">) — https://nivo78.github.io/N78-Public-Legal/pages/N78-ThinStl.terms.html</w:t>
-      </w:r>
-    </w:p>
-    <w:p>
-      <w:pPr>
-        <w:pStyle w:val="Compact"/>
-        <w:numPr>
-          <w:ilvl w:val="0"/>
-          <w:numId w:val="1002"/>
-        </w:numPr>
-      </w:pPr>
-      <w:r>
-        <w:rPr>
-          <w:b/>
-          <w:bCs/>
-        </w:rPr>
-        <w:t xml:space="preserve">N78-Track — Operator disclaimer</w:t>
+        <w:t xml:space="preserve">) - https://nivo78.github.io/N78-Public-Legal/pages/N78-ThinStl.terms.html</w:t>
+      </w:r>
+    </w:p>
+    <w:p>
+      <w:pPr>
+        <w:pStyle w:val="Compact"/>
+        <w:numPr>
+          <w:ilvl w:val="0"/>
+          <w:numId w:val="1002"/>
+        </w:numPr>
+      </w:pPr>
+      <w:r>
+        <w:rPr>
+          <w:b/>
+          <w:bCs/>
+        </w:rPr>
+        <w:t xml:space="preserve">N78-Track - Operator disclaimer</w:t>
       </w:r>
       <w:r>
         <w:t xml:space="preserve"> </w:t>
@@ -1717,23 +1717,23 @@
         <w:t xml:space="preserve">pages/N78-Track.operator.html</w:t>
       </w:r>
       <w:r>
-        <w:t xml:space="preserve">) — https://nivo78.github.io/N78-Public-Legal/pages/N78-Track.operator.html</w:t>
-      </w:r>
-    </w:p>
-    <w:p>
-      <w:pPr>
-        <w:pStyle w:val="Compact"/>
-        <w:numPr>
-          <w:ilvl w:val="0"/>
-          <w:numId w:val="1002"/>
-        </w:numPr>
-      </w:pPr>
-      <w:r>
-        <w:rPr>
-          <w:b/>
-          <w:bCs/>
-        </w:rPr>
-        <w:t xml:space="preserve">N78-Track — Privacy</w:t>
+        <w:t xml:space="preserve">) - https://nivo78.github.io/N78-Public-Legal/pages/N78-Track.operator.html</w:t>
+      </w:r>
+    </w:p>
+    <w:p>
+      <w:pPr>
+        <w:pStyle w:val="Compact"/>
+        <w:numPr>
+          <w:ilvl w:val="0"/>
+          <w:numId w:val="1002"/>
+        </w:numPr>
+      </w:pPr>
+      <w:r>
+        <w:rPr>
+          <w:b/>
+          <w:bCs/>
+        </w:rPr>
+        <w:t xml:space="preserve">N78-Track - Privacy</w:t>
       </w:r>
       <w:r>
         <w:t xml:space="preserve"> </w:t>
@@ -1748,23 +1748,23 @@
         <w:t xml:space="preserve">pages/N78-Track.privacy.html</w:t>
       </w:r>
       <w:r>
-        <w:t xml:space="preserve">) — https://nivo78.github.io/N78-Public-Legal/pages/N78-Track.privacy.html</w:t>
-      </w:r>
-    </w:p>
-    <w:p>
-      <w:pPr>
-        <w:pStyle w:val="Compact"/>
-        <w:numPr>
-          <w:ilvl w:val="0"/>
-          <w:numId w:val="1002"/>
-        </w:numPr>
-      </w:pPr>
-      <w:r>
-        <w:rPr>
-          <w:b/>
-          <w:bCs/>
-        </w:rPr>
-        <w:t xml:space="preserve">N78-Track — Terms</w:t>
+        <w:t xml:space="preserve">) - https://nivo78.github.io/N78-Public-Legal/pages/N78-Track.privacy.html</w:t>
+      </w:r>
+    </w:p>
+    <w:p>
+      <w:pPr>
+        <w:pStyle w:val="Compact"/>
+        <w:numPr>
+          <w:ilvl w:val="0"/>
+          <w:numId w:val="1002"/>
+        </w:numPr>
+      </w:pPr>
+      <w:r>
+        <w:rPr>
+          <w:b/>
+          <w:bCs/>
+        </w:rPr>
+        <w:t xml:space="preserve">N78-Track - Terms</w:t>
       </w:r>
       <w:r>
         <w:t xml:space="preserve"> </w:t>
@@ -1779,23 +1779,23 @@
         <w:t xml:space="preserve">pages/N78-Track.terms.html</w:t>
       </w:r>
       <w:r>
-        <w:t xml:space="preserve">) — https://nivo78.github.io/N78-Public-Legal/pages/N78-Track.terms.html</w:t>
-      </w:r>
-    </w:p>
-    <w:p>
-      <w:pPr>
-        <w:pStyle w:val="Compact"/>
-        <w:numPr>
-          <w:ilvl w:val="0"/>
-          <w:numId w:val="1002"/>
-        </w:numPr>
-      </w:pPr>
-      <w:r>
-        <w:rPr>
-          <w:b/>
-          <w:bCs/>
-        </w:rPr>
-        <w:t xml:space="preserve">Successor — Operator disclaimer</w:t>
+        <w:t xml:space="preserve">) - https://nivo78.github.io/N78-Public-Legal/pages/N78-Track.terms.html</w:t>
+      </w:r>
+    </w:p>
+    <w:p>
+      <w:pPr>
+        <w:pStyle w:val="Compact"/>
+        <w:numPr>
+          <w:ilvl w:val="0"/>
+          <w:numId w:val="1002"/>
+        </w:numPr>
+      </w:pPr>
+      <w:r>
+        <w:rPr>
+          <w:b/>
+          <w:bCs/>
+        </w:rPr>
+        <w:t xml:space="preserve">Successor - Operator disclaimer</w:t>
       </w:r>
       <w:r>
         <w:t xml:space="preserve"> </w:t>
@@ -1810,23 +1810,23 @@
         <w:t xml:space="preserve">pages/Successor.operator.html</w:t>
       </w:r>
       <w:r>
-        <w:t xml:space="preserve">) — https://nivo78.github.io/N78-Public-Legal/pages/Successor.operator.html</w:t>
-      </w:r>
-    </w:p>
-    <w:p>
-      <w:pPr>
-        <w:pStyle w:val="Compact"/>
-        <w:numPr>
-          <w:ilvl w:val="0"/>
-          <w:numId w:val="1002"/>
-        </w:numPr>
-      </w:pPr>
-      <w:r>
-        <w:rPr>
-          <w:b/>
-          <w:bCs/>
-        </w:rPr>
-        <w:t xml:space="preserve">Successor — Privacy</w:t>
+        <w:t xml:space="preserve">) - https://nivo78.github.io/N78-Public-Legal/pages/Successor.operator.html</w:t>
+      </w:r>
+    </w:p>
+    <w:p>
+      <w:pPr>
+        <w:pStyle w:val="Compact"/>
+        <w:numPr>
+          <w:ilvl w:val="0"/>
+          <w:numId w:val="1002"/>
+        </w:numPr>
+      </w:pPr>
+      <w:r>
+        <w:rPr>
+          <w:b/>
+          <w:bCs/>
+        </w:rPr>
+        <w:t xml:space="preserve">Successor - Privacy</w:t>
       </w:r>
       <w:r>
         <w:t xml:space="preserve"> </w:t>
@@ -1841,23 +1841,23 @@
         <w:t xml:space="preserve">pages/Successor.privacy.html</w:t>
       </w:r>
       <w:r>
-        <w:t xml:space="preserve">) — https://nivo78.github.io/N78-Public-Legal/pages/Successor.privacy.html</w:t>
-      </w:r>
-    </w:p>
-    <w:p>
-      <w:pPr>
-        <w:pStyle w:val="Compact"/>
-        <w:numPr>
-          <w:ilvl w:val="0"/>
-          <w:numId w:val="1002"/>
-        </w:numPr>
-      </w:pPr>
-      <w:r>
-        <w:rPr>
-          <w:b/>
-          <w:bCs/>
-        </w:rPr>
-        <w:t xml:space="preserve">Successor — Terms</w:t>
+        <w:t xml:space="preserve">) - https://nivo78.github.io/N78-Public-Legal/pages/Successor.privacy.html</w:t>
+      </w:r>
+    </w:p>
+    <w:p>
+      <w:pPr>
+        <w:pStyle w:val="Compact"/>
+        <w:numPr>
+          <w:ilvl w:val="0"/>
+          <w:numId w:val="1002"/>
+        </w:numPr>
+      </w:pPr>
+      <w:r>
+        <w:rPr>
+          <w:b/>
+          <w:bCs/>
+        </w:rPr>
+        <w:t xml:space="preserve">Successor - Terms</w:t>
       </w:r>
       <w:r>
         <w:t xml:space="preserve"> </w:t>
@@ -1872,7 +1872,7 @@
         <w:t xml:space="preserve">pages/Successor.terms.html</w:t>
       </w:r>
       <w:r>
-        <w:t xml:space="preserve">) — https://nivo78.github.io/N78-Public-Legal/pages/Successor.terms.html</w:t>
+        <w:t xml:space="preserve">) - https://nivo78.github.io/N78-Public-Legal/pages/Successor.terms.html</w:t>
       </w:r>
     </w:p>
     <w:bookmarkEnd w:id="10"/>

</xml_diff>